<commit_message>
docs(paper): retain the previously revised BERT-format artifacts
Include the existing tracked BERT-format changes requested for repository delivery. Keep this archival format distinct from the two latest authoritative editions.
</commit_message>
<xml_diff>
--- a/output/docs/Revon_Research_Paper_BERT.docx
+++ b/output/docs/Revon_Research_Paper_BERT.docx
@@ -185,7 +185,7 @@
         <w:keepNext w:val="0"/>
         <w:spacing w:before="0" w:after="0" w:line="272" w:lineRule="exact"/>
         <w:ind w:firstLine="216"/>
-        <w:jc w:val="both"/>
+        <w:jc w:val="left"/>
         <w:sectPr>
           <w:type w:val="continuous"/>
           <w:headerReference w:type="default" r:id="rId11"/>
@@ -228,22 +228,7 @@
         <w:t>Abstract:</w:t>
       </w:r>
       <w:r>
-        <w:t xml:space="preserve"> Versioning structured data means keeping exact historical states, handling sparse updates, and comparing versions without copying the full dataset each time. Revon is a Python prototype built on an immutable, fixed-depth Merkle hash trie. Its hybrid variant, Revon-H, stores addressed changesets and chooses between log aggregation and hash-pruned differencing. We tested Snapshot, Log-only, forced-Merkle Revon-M, Revon-H, and Dolt 2.3.1 on deterministic workloads of up to 100,000 rows, across 540 successful executions. For the tested workflows, median paired Dolt/Revon-H diff-latency ratios ranged from 7.14 to 625.10, and all seven-trial 95% bootstrap intervals favored Revon-H latency. Those are interface-level results: the comparison includes different APIs and does not isolate tree or index performance. A separate three-seed study could not resolve the 50-commit ablation result. We ran the experiments on one Windows host and under WSL2 on that same computer. The results show workload-dependent trade-offs for this prototype; they do not establish general or production-level superiority.</w:t>
-      </w:r>
-    </w:p>
-    <w:p>
-      <w:pPr>
-        <w:jc w:val="both"/>
-        <w:ind w:left="340" w:right="340" w:firstLine="216"/>
-        <w:keepNext w:val="0"/>
-        <w:spacing w:line="272" w:lineRule="exact" w:after="0"/>
-      </w:pPr>
-      <w:r>
-        <w:rPr>
-          <w:rFonts w:ascii="Times New Roman" w:hAnsi="Times New Roman" w:cs="Times New Roman" w:eastAsia="Times New Roman"/>
-          <w:sz w:val="22"/>
-        </w:rPr>
-        <w:t>Versioning structured datasets requires durable history, efficient sparse updates, historical reconstruction, and comparison without copying every record. Revon is a Python prototype built around an immutable fixed-depth Merkle hash trie; Revon-H adds addressed changesets and adaptively selects log aggregation or hash-pruned differencing. We compare Snapshot, Log-only, forced-Merkle Revon-M, Revon-H, and Dolt 2.3.1 on deterministic workloads up to 100,000 rows, using evidence from 540 successful executions. Within the declared API and CLI workflows, median paired Dolt/Revon-H diff-latency ratios range from 7.14 to 625.10, and all seven-trial 95% bootstrap intervals favor Revon-H latency. These are workflow-level results: the comparison includes different interfaces and does not isolate index or tree performance. A separate three-seed study found the 50-commit ablation result inconclusive. Experiments used one Windows host and WSL2 on the same physical computer. The results support workload-specific trade-offs for this prototype, not general or production-level superiority.</w:t>
+        <w:t xml:space="preserve"> Versioning structured data means keeping exact historical states, handling sparse updates, and comparing versions without copying the full dataset each time. Revon is a Python prototype built on an immutable, fixed-depth Merkle hash trie. Its hybrid variant, Revon-H, stores addressed changesets and chooses between log aggregation and hash-pruned differencing. We tested Snapshot, Log-only, forced-Merkle Revon-M, Revon-H, and Dolt 2.3.1 on synthetic workloads of up to 100,000 rows, across 540 successful executions. In that synthetic study, median paired Dolt/Revon-H diff-latency ratios ranged from 7.14 to 625.10, and all seven-trial 95% bootstrap intervals favored Revon-H latency. Those are interface-level results: the comparison includes different APIs and does not isolate tree or index performance. A separate three-seed study could not resolve the 50-commit ablation result. A separate public TLC record evaluation reaches 1,000,000 records with generated update histories. We used one Windows host; the earlier synthetic study also includes WSL2 on that computer. The results show workload-dependent trade-offs for this prototype; they do not establish general or production-level superiority.</w:t>
       </w:r>
     </w:p>
     <w:p>
@@ -858,6 +843,7 @@
         <w:trPr>
           <w:cantSplit/>
           <w:tblHeader/>
+          <w:cantSplit/>
         </w:trPr>
         <w:tc>
           <w:tcPr>
@@ -879,6 +865,7 @@
           </w:tcPr>
           <w:p>
             <w:pPr>
+              <w:keepNext/>
               <w:keepLines/>
             </w:pPr>
             <w:r>
@@ -909,6 +896,7 @@
           </w:tcPr>
           <w:p>
             <w:pPr>
+              <w:keepNext/>
               <w:keepLines/>
             </w:pPr>
             <w:r>
@@ -939,6 +927,7 @@
           </w:tcPr>
           <w:p>
             <w:pPr>
+              <w:keepNext/>
               <w:keepLines/>
             </w:pPr>
             <w:r>
@@ -952,6 +941,7 @@
       </w:tr>
       <w:tr>
         <w:trPr>
+          <w:cantSplit/>
           <w:cantSplit/>
         </w:trPr>
         <w:tc>
@@ -1060,6 +1050,7 @@
       <w:tr>
         <w:trPr>
           <w:cantSplit/>
+          <w:cantSplit/>
         </w:trPr>
         <w:tc>
           <w:tcPr>
@@ -1167,6 +1158,7 @@
       <w:tr>
         <w:trPr>
           <w:cantSplit/>
+          <w:cantSplit/>
         </w:trPr>
         <w:tc>
           <w:tcPr>
@@ -1274,6 +1266,7 @@
       <w:tr>
         <w:trPr>
           <w:cantSplit/>
+          <w:cantSplit/>
         </w:trPr>
         <w:tc>
           <w:tcPr>
@@ -1381,6 +1374,7 @@
       <w:tr>
         <w:trPr>
           <w:cantSplit/>
+          <w:cantSplit/>
         </w:trPr>
         <w:tc>
           <w:tcPr>
@@ -1488,6 +1482,7 @@
       <w:tr>
         <w:trPr>
           <w:cantSplit/>
+          <w:cantSplit/>
         </w:trPr>
         <w:tc>
           <w:tcPr>
@@ -1595,6 +1590,7 @@
       <w:tr>
         <w:trPr>
           <w:cantSplit/>
+          <w:cantSplit/>
         </w:trPr>
         <w:tc>
           <w:tcPr>
@@ -1702,6 +1698,7 @@
       <w:tr>
         <w:trPr>
           <w:cantSplit/>
+          <w:cantSplit/>
         </w:trPr>
         <w:tc>
           <w:tcPr>
@@ -1809,6 +1806,7 @@
       <w:tr>
         <w:trPr>
           <w:cantSplit/>
+          <w:cantSplit/>
         </w:trPr>
         <w:tc>
           <w:tcPr>
@@ -1916,6 +1914,7 @@
       <w:tr>
         <w:trPr>
           <w:cantSplit/>
+          <w:cantSplit/>
         </w:trPr>
         <w:tc>
           <w:tcPr>
@@ -2022,6 +2021,7 @@
       </w:tr>
       <w:tr>
         <w:trPr>
+          <w:cantSplit/>
           <w:cantSplit/>
         </w:trPr>
         <w:tc>
@@ -2334,7 +2334,7 @@
         </w:r>
       </w:hyperlink>
       <w:r>
-        <w:t>, which narrows our claim: Revon evaluates adaptive differencing for a fixed-depth hash trie; it is not a general-purpose data-versioning platform. Snapshot and Log-only remain representation baselines. Our results do not establish performance on public datasets, independent hardware, concurrent workloads, or production systems.</w:t>
+        <w:t>, which narrows our claim: Revon evaluates adaptive differencing for a fixed-depth hash trie; it is not a general-purpose data-versioning platform. Snapshot and Log-only remain representation baselines. The public-record extension covers one release with generated updates. It does not establish performance across diverse datasets, independent hardware, concurrent workloads, or production systems.</w:t>
       </w:r>
     </w:p>
     <w:p>
@@ -2384,7 +2384,7 @@
         </w:rPr>
         <w:drawing>
           <wp:inline distT="0" distB="0" distL="0" distR="0" wp14:anchorId="413E2FC9" wp14:editId="09BC0E8F">
-            <wp:extent cx="3063240" cy="1797100"/>
+            <wp:extent cx="2758757" cy="1618470"/>
             <wp:effectExtent l="0" t="0" r="0" b="0"/>
             <wp:docPr id="1" name="Picture 1" descr="Revon layered architecture showing the frontend, REST API, Revon-H core, SQLite object store, and the research contribution boundary." title="Revon layered architecture showing the frontend, REST API, Revon-H core, SQLite object store, and the research contribution boundary"/>
             <wp:cNvGraphicFramePr>
@@ -2406,7 +2406,7 @@
                   <pic:spPr>
                     <a:xfrm>
                       <a:off x="0" y="0"/>
-                      <a:ext cx="3063240" cy="1797100"/>
+                      <a:ext cx="2758757" cy="1618470"/>
                     </a:xfrm>
                     <a:prstGeom prst="rect">
                       <a:avLst/>
@@ -2547,7 +2547,7 @@
         <w:lastRenderedPageBreak/>
         <w:drawing>
           <wp:inline distT="0" distB="0" distL="0" distR="0" wp14:anchorId="0E8743F1" wp14:editId="76462CAB">
-            <wp:extent cx="3063240" cy="1592884"/>
+            <wp:extent cx="2758757" cy="1434553"/>
             <wp:effectExtent l="0" t="0" r="0" b="0"/>
             <wp:docPr id="2" name="Picture 2" descr="Incremental commit workflow followed by Revon-H selection between addressed changeset aggregation and hash-pruned Merkle comparison." title="Incremental commit workflow followed by Revon-H selection between addressed changeset aggregation and hash-pruned Merkle comparison"/>
             <wp:cNvGraphicFramePr>
@@ -2569,7 +2569,7 @@
                   <pic:spPr>
                     <a:xfrm>
                       <a:off x="0" y="0"/>
-                      <a:ext cx="3063240" cy="1592884"/>
+                      <a:ext cx="2758757" cy="1434553"/>
                     </a:xfrm>
                     <a:prstGeom prst="rect">
                       <a:avLst/>
@@ -2693,6 +2693,7 @@
           <w:cantSplit/>
           <w:tblHeader/>
           <w:jc w:val="center"/>
+          <w:cantSplit/>
         </w:trPr>
         <w:tc>
           <w:tcPr>
@@ -2714,6 +2715,7 @@
           </w:tcPr>
           <w:p>
             <w:pPr>
+              <w:keepNext/>
               <w:keepLines/>
             </w:pPr>
             <w:r>
@@ -2744,6 +2746,7 @@
           </w:tcPr>
           <w:p>
             <w:pPr>
+              <w:keepNext/>
               <w:keepLines/>
             </w:pPr>
             <w:r>
@@ -2774,6 +2777,7 @@
           </w:tcPr>
           <w:p>
             <w:pPr>
+              <w:keepNext/>
               <w:keepLines/>
             </w:pPr>
             <w:r>
@@ -2804,6 +2808,7 @@
           </w:tcPr>
           <w:p>
             <w:pPr>
+              <w:keepNext/>
               <w:keepLines/>
             </w:pPr>
             <w:r>
@@ -2834,6 +2839,7 @@
           </w:tcPr>
           <w:p>
             <w:pPr>
+              <w:keepNext/>
               <w:keepLines/>
             </w:pPr>
             <w:r>
@@ -2849,6 +2855,7 @@
         <w:trPr>
           <w:cantSplit/>
           <w:jc w:val="center"/>
+          <w:cantSplit/>
         </w:trPr>
         <w:tc>
           <w:tcPr>
@@ -3025,6 +3032,7 @@
         <w:trPr>
           <w:cantSplit/>
           <w:jc w:val="center"/>
+          <w:cantSplit/>
         </w:trPr>
         <w:tc>
           <w:tcPr>
@@ -3201,6 +3209,7 @@
         <w:trPr>
           <w:cantSplit/>
           <w:jc w:val="center"/>
+          <w:cantSplit/>
         </w:trPr>
         <w:tc>
           <w:tcPr>
@@ -3377,6 +3386,7 @@
         <w:trPr>
           <w:cantSplit/>
           <w:jc w:val="center"/>
+          <w:cantSplit/>
         </w:trPr>
         <w:tc>
           <w:tcPr>
@@ -3553,6 +3563,7 @@
         <w:trPr>
           <w:cantSplit/>
           <w:jc w:val="center"/>
+          <w:cantSplit/>
         </w:trPr>
         <w:tc>
           <w:tcPr>
@@ -3729,6 +3740,7 @@
         <w:trPr>
           <w:cantSplit/>
           <w:jc w:val="center"/>
+          <w:cantSplit/>
         </w:trPr>
         <w:tc>
           <w:tcPr>
@@ -3905,6 +3917,7 @@
         <w:trPr>
           <w:cantSplit/>
           <w:jc w:val="center"/>
+          <w:cantSplit/>
         </w:trPr>
         <w:tc>
           <w:tcPr>
@@ -4081,6 +4094,7 @@
         <w:trPr>
           <w:cantSplit/>
           <w:jc w:val="center"/>
+          <w:cantSplit/>
         </w:trPr>
         <w:tc>
           <w:tcPr>
@@ -4368,7 +4382,7 @@
         </w:rPr>
         <w:drawing>
           <wp:inline distT="0" distB="0" distL="0" distR="0" wp14:anchorId="7D2C9E31" wp14:editId="33BDCA98">
-            <wp:extent cx="3063240" cy="1723072"/>
+            <wp:extent cx="2758757" cy="1551800"/>
             <wp:effectExtent l="0" t="0" r="0" b="0"/>
             <wp:docPr id="3" name="Picture 3" descr="Calibration plot comparing log aggregation and forced-Merkle diff latency across accumulated operation counts, with the frozen 4,096-operation boundary." title="Calibration plot comparing log aggregation and forced-Merkle diff latency across accumulated operation counts, with the frozen 4,096-operation boundary"/>
             <wp:cNvGraphicFramePr>
@@ -4390,7 +4404,7 @@
                   <pic:spPr>
                     <a:xfrm>
                       <a:off x="0" y="0"/>
-                      <a:ext cx="3063240" cy="1723072"/>
+                      <a:ext cx="2758757" cy="1551800"/>
                     </a:xfrm>
                     <a:prstGeom prst="rect">
                       <a:avLst/>
@@ -4429,6 +4443,695 @@
     </w:p>
     <w:p>
       <w:pPr>
+        <w:pStyle w:val="Heading2"/>
+        <w:keepNext/>
+        <w:pageBreakBefore w:val="0"/>
+        <w:spacing w:before="140" w:after="60"/>
+        <w:ind w:firstLine="0"/>
+        <w:jc w:val="left"/>
+      </w:pPr>
+      <w:r>
+        <w:rPr>
+          <w:rFonts w:ascii="Times New Roman" w:hAnsi="Times New Roman" w:cs="Times New Roman" w:eastAsia="Times New Roman"/>
+          <w:b/>
+          <w:sz w:val="22"/>
+        </w:rPr>
+        <w:t>4.4 Public Dataset and Scalability Evaluation</w:t>
+      </w:r>
+    </w:p>
+    <w:p>
+      <w:pPr>
+        <w:keepNext w:val="0"/>
+        <w:pageBreakBefore w:val="0"/>
+        <w:spacing w:line="272" w:lineRule="exact" w:after="0"/>
+        <w:ind w:firstLine="216"/>
+        <w:jc w:val="both"/>
+      </w:pPr>
+      <w:r>
+        <w:t xml:space="preserve">We extend the synthetic evaluation with January 2024 yellow-taxi records from the New York City Taxi and Limousine Commission (NYC TLC) </w:t>
+      </w:r>
+      <w:hyperlink w:anchor="ref_31">
+        <w:r>
+          <w:t>(NYC TLC, 2024)</w:t>
+        </w:r>
+      </w:hyperlink>
+      <w:r>
+        <w:t xml:space="preserve">. The checksum-pinned Parquet file contains 2,964,624 rows; a dispersed affine permutation selects nested subsets of 10,000, 100,000 and 1,000,000 rows using seed 20261001. We retain eleven fields: vendor, pickup/drop-off times, passenger count, distance, pickup/drop-off locations, payment type, fare, tip and total. Keys combine the release, file-checksum prefix and physical row ordinal, and therefore identify rows within this frozen file rather than trips across releases. Compact sorted-key UTF-8 JSON preserves values; nulls remain null. The million-row subset has 47,277 missing passenger counts and no serialization failures. Identical field values remain separate rows. The affine sample is not a uniformly random permutation.</w:t>
+      </w:r>
+    </w:p>
+    <w:p>
+      <w:pPr>
+        <w:keepNext w:val="0"/>
+        <w:pageBreakBefore w:val="0"/>
+        <w:spacing w:line="272" w:lineRule="exact" w:after="0"/>
+        <w:ind w:firstLine="216"/>
+        <w:jc w:val="both"/>
+      </w:pPr>
+      <w:r>
+        <w:t>Monthly trip files contain different trips, so we generate synthetic correction histories over these public records. Each commit samples distinct keys with a fixed seed, increases fare and total by 0.01, and preserves the other fields; keys may repeat across commits. Table III specifies the separate scale, history and density sweeps. All systems receive identical states and histories. We retain b=8, d=4 and the 4,096-operation selector. Diff compares version 1 with version H+1. Import is separate from incremental version creation; each trial reports the median of H commit intervals. Canonical output materialization is included in diff and checkout. Every trial checks both endpoint states and semantic diff; the first measured trial for each system/configuration checks every historical version outside timing. Directory footprint is measured before close and compaction. These are whole-system workflow measurements.</w:t>
+      </w:r>
+    </w:p>
+    <w:p>
+      <w:pPr>
+        <w:keepNext w:val="0"/>
+        <w:pageBreakBefore w:val="0"/>
+        <w:spacing w:line="272" w:lineRule="exact" w:after="0"/>
+        <w:ind w:firstLine="216"/>
+        <w:jc w:val="both"/>
+      </w:pPr>
+      <w:r>
+        <w:t>The public-data run used Python 3.12.14 on the same Windows host, with 15.64 GiB visible RAM and 4.14 GiB available at launch. Available memory was not held constant. Each configuration scheduled 2 warm-ups and 7 measured trials. All configurations have 7 successful measured trials. Clean workers and counterbalanced order follow the existing protocol; pilot measurements are excluded. Each trial has a 900-second wall-clock limit including setup and verification. We report medians and linearly interpolated interquartile ranges. 324 of 325 retained executions completed successfully. The source checksum, workload digests, raw trials, environment metadata, verification hashes and reproduction commands accompany the new evidence; prior bundles are preserved.</w:t>
+      </w:r>
+    </w:p>
+    <w:p>
+      <w:pPr>
+        <w:pStyle w:val="Caption"/>
+        <w:keepNext/>
+        <w:keepLines/>
+        <w:pageBreakBefore w:val="0"/>
+        <w:spacing w:before="40" w:after="40" w:line="240" w:lineRule="exact"/>
+        <w:ind w:firstLine="0"/>
+        <w:jc w:val="center"/>
+      </w:pPr>
+      <w:r>
+        <w:t xml:space="preserve">TABLE III. Public TLC dataset </w:t>
+      </w:r>
+      <w:hyperlink w:anchor="ref_31">
+        <w:r>
+          <w:t>(NYC TLC, 2024)</w:t>
+        </w:r>
+      </w:hyperlink>
+      <w:r>
+        <w:t xml:space="preserve">, January 2024; all histories are generated corrections.</w:t>
+      </w:r>
+    </w:p>
+    <w:tbl>
+      <w:tblPr>
+        <w:tblW w:type="auto" w:w="0"/>
+        <w:tblLayout w:type="fixed"/>
+        <w:tblLook w:firstColumn="1" w:firstRow="1" w:lastColumn="0" w:lastRow="0" w:noHBand="0" w:noVBand="1" w:val="04A0"/>
+        <w:tblBorders>
+          <w:top w:val="single" w:sz="4" w:color="B6BEC5"/>
+          <w:bottom w:val="single" w:sz="4" w:color="B6BEC5"/>
+          <w:insideH w:val="single" w:sz="4" w:color="B6BEC5"/>
+        </w:tblBorders>
+      </w:tblPr>
+      <w:tblGrid>
+        <w:gridCol w:w="1086"/>
+        <w:gridCol w:w="3258"/>
+      </w:tblGrid>
+      <w:tr>
+        <w:trPr>
+          <w:cantSplit/>
+          <w:tblHeader/>
+        </w:trPr>
+        <w:tc>
+          <w:tcPr>
+            <w:tcW w:type="dxa" w:w="1086"/>
+            <w:vAlign w:val="center"/>
+            <w:tcMar>
+              <w:left w:w="58" w:type="dxa"/>
+              <w:right w:w="58" w:type="dxa"/>
+            </w:tcMar>
+          </w:tcPr>
+          <w:p>
+            <w:pPr>
+              <w:keepNext/>
+              <w:spacing w:after="40" w:before="40" w:line="240" w:lineRule="auto"/>
+              <w:ind w:firstLine="0" w:left="0" w:right="0"/>
+              <w:jc w:val="left"/>
+            </w:pPr>
+            <w:r>
+              <w:rPr>
+                <w:rFonts w:ascii="Times New Roman" w:hAnsi="Times New Roman"/>
+                <w:b/>
+                <w:sz w:val="16"/>
+              </w:rPr>
+              <w:t>Parameter</w:t>
+            </w:r>
+          </w:p>
+        </w:tc>
+        <w:tc>
+          <w:tcPr>
+            <w:tcW w:type="dxa" w:w="3258"/>
+            <w:vAlign w:val="center"/>
+            <w:tcMar>
+              <w:left w:w="58" w:type="dxa"/>
+              <w:right w:w="58" w:type="dxa"/>
+            </w:tcMar>
+          </w:tcPr>
+          <w:p>
+            <w:pPr>
+              <w:keepNext/>
+              <w:spacing w:after="40" w:before="40" w:line="240" w:lineRule="auto"/>
+              <w:ind w:firstLine="0" w:left="0" w:right="0"/>
+              <w:jc w:val="left"/>
+            </w:pPr>
+            <w:r>
+              <w:rPr>
+                <w:rFonts w:ascii="Times New Roman" w:hAnsi="Times New Roman"/>
+                <w:b/>
+                <w:sz w:val="16"/>
+              </w:rPr>
+              <w:t>Dataset and sweep specification</w:t>
+            </w:r>
+          </w:p>
+        </w:tc>
+      </w:tr>
+      <w:tr>
+        <w:trPr>
+          <w:cantSplit/>
+        </w:trPr>
+        <w:tc>
+          <w:tcPr>
+            <w:tcW w:type="dxa" w:w="1086"/>
+            <w:vAlign w:val="center"/>
+            <w:tcMar>
+              <w:left w:w="58" w:type="dxa"/>
+              <w:right w:w="58" w:type="dxa"/>
+            </w:tcMar>
+          </w:tcPr>
+          <w:p>
+            <w:pPr>
+              <w:keepNext/>
+              <w:spacing w:after="40" w:before="40" w:line="240" w:lineRule="auto"/>
+              <w:ind w:firstLine="0" w:left="0" w:right="0"/>
+              <w:jc w:val="left"/>
+            </w:pPr>
+            <w:r>
+              <w:rPr>
+                <w:rFonts w:ascii="Times New Roman" w:hAnsi="Times New Roman"/>
+                <w:b w:val="0"/>
+                <w:sz w:val="16"/>
+              </w:rPr>
+              <w:t>Dataset</w:t>
+            </w:r>
+          </w:p>
+        </w:tc>
+        <w:tc>
+          <w:tcPr>
+            <w:tcW w:type="dxa" w:w="3258"/>
+            <w:vAlign w:val="center"/>
+            <w:tcMar>
+              <w:left w:w="58" w:type="dxa"/>
+              <w:right w:w="58" w:type="dxa"/>
+            </w:tcMar>
+          </w:tcPr>
+          <w:p>
+            <w:pPr>
+              <w:keepNext/>
+              <w:spacing w:after="40" w:before="40" w:line="240" w:lineRule="auto"/>
+              <w:ind w:firstLine="0" w:left="0" w:right="0"/>
+              <w:jc w:val="left"/>
+            </w:pPr>
+            <w:r>
+              <w:rPr>
+                <w:rFonts w:ascii="Times New Roman" w:hAnsi="Times New Roman"/>
+                <w:b w:val="0"/>
+                <w:sz w:val="16"/>
+              </w:rPr>
+              <w:t xml:space="preserve">NYC TLC yellow taxi, January 2024 </w:t>
+            </w:r>
+            <w:hyperlink w:anchor="ref_31">
+              <w:r>
+                <w:rPr>
+                  <w:rFonts w:ascii="Times New Roman" w:hAnsi="Times New Roman"/>
+                  <w:b w:val="0"/>
+                  <w:sz w:val="16"/>
+                </w:rPr>
+                <w:t>(NYC TLC, 2024)</w:t>
+              </w:r>
+            </w:hyperlink>
+            <w:r>
+              <w:rPr>
+                <w:rFonts w:ascii="Times New Roman" w:hAnsi="Times New Roman"/>
+                <w:b w:val="0"/>
+                <w:sz w:val="16"/>
+              </w:rPr>
+              <w:t xml:space="preserve"/>
+            </w:r>
+          </w:p>
+        </w:tc>
+      </w:tr>
+      <w:tr>
+        <w:trPr>
+          <w:cantSplit/>
+        </w:trPr>
+        <w:tc>
+          <w:tcPr>
+            <w:tcW w:type="dxa" w:w="1086"/>
+            <w:vAlign w:val="center"/>
+            <w:tcMar>
+              <w:left w:w="58" w:type="dxa"/>
+              <w:right w:w="58" w:type="dxa"/>
+            </w:tcMar>
+          </w:tcPr>
+          <w:p>
+            <w:pPr>
+              <w:keepNext/>
+              <w:spacing w:after="40" w:before="40" w:line="240" w:lineRule="auto"/>
+              <w:ind w:firstLine="0" w:left="0" w:right="0"/>
+              <w:jc w:val="left"/>
+            </w:pPr>
+            <w:r>
+              <w:rPr>
+                <w:rFonts w:ascii="Times New Roman" w:hAnsi="Times New Roman"/>
+                <w:b w:val="0"/>
+                <w:sz w:val="16"/>
+              </w:rPr>
+              <w:t>Records</w:t>
+            </w:r>
+          </w:p>
+        </w:tc>
+        <w:tc>
+          <w:tcPr>
+            <w:tcW w:type="dxa" w:w="3258"/>
+            <w:vAlign w:val="center"/>
+            <w:tcMar>
+              <w:left w:w="58" w:type="dxa"/>
+              <w:right w:w="58" w:type="dxa"/>
+            </w:tcMar>
+          </w:tcPr>
+          <w:p>
+            <w:pPr>
+              <w:keepNext/>
+              <w:spacing w:after="40" w:before="40" w:line="240" w:lineRule="auto"/>
+              <w:ind w:firstLine="0" w:left="0" w:right="0"/>
+              <w:jc w:val="left"/>
+            </w:pPr>
+            <w:r>
+              <w:rPr>
+                <w:rFonts w:ascii="Times New Roman" w:hAnsi="Times New Roman"/>
+                <w:b w:val="0"/>
+                <w:sz w:val="16"/>
+              </w:rPr>
+              <w:t>2,964,624 source rows; 1,000,000 retained; nested subsets of 10k, 100k and 1M</w:t>
+            </w:r>
+          </w:p>
+        </w:tc>
+      </w:tr>
+      <w:tr>
+        <w:trPr>
+          <w:cantSplit/>
+        </w:trPr>
+        <w:tc>
+          <w:tcPr>
+            <w:tcW w:type="dxa" w:w="1086"/>
+            <w:vAlign w:val="center"/>
+            <w:tcMar>
+              <w:left w:w="58" w:type="dxa"/>
+              <w:right w:w="58" w:type="dxa"/>
+            </w:tcMar>
+          </w:tcPr>
+          <w:p>
+            <w:pPr>
+              <w:keepNext/>
+              <w:spacing w:after="40" w:before="40" w:line="240" w:lineRule="auto"/>
+              <w:ind w:firstLine="0" w:left="0" w:right="0"/>
+              <w:jc w:val="left"/>
+            </w:pPr>
+            <w:r>
+              <w:rPr>
+                <w:rFonts w:ascii="Times New Roman" w:hAnsi="Times New Roman"/>
+                <w:b w:val="0"/>
+                <w:sz w:val="16"/>
+              </w:rPr>
+              <w:t>Fields</w:t>
+            </w:r>
+          </w:p>
+        </w:tc>
+        <w:tc>
+          <w:tcPr>
+            <w:tcW w:type="dxa" w:w="3258"/>
+            <w:vAlign w:val="center"/>
+            <w:tcMar>
+              <w:left w:w="58" w:type="dxa"/>
+              <w:right w:w="58" w:type="dxa"/>
+            </w:tcMar>
+          </w:tcPr>
+          <w:p>
+            <w:pPr>
+              <w:keepNext/>
+              <w:spacing w:after="40" w:before="40" w:line="240" w:lineRule="auto"/>
+              <w:ind w:firstLine="0" w:left="0" w:right="0"/>
+              <w:jc w:val="left"/>
+            </w:pPr>
+            <w:r>
+              <w:rPr>
+                <w:rFonts w:ascii="Times New Roman" w:hAnsi="Times New Roman"/>
+                <w:b w:val="0"/>
+                <w:sz w:val="16"/>
+              </w:rPr>
+              <w:t>Vendor; pickup/drop-off times; passenger count; distance; pickup/drop-off locations; payment type; fare; tip; total</w:t>
+            </w:r>
+          </w:p>
+        </w:tc>
+      </w:tr>
+      <w:tr>
+        <w:trPr>
+          <w:cantSplit/>
+        </w:trPr>
+        <w:tc>
+          <w:tcPr>
+            <w:tcW w:type="dxa" w:w="1086"/>
+            <w:vAlign w:val="center"/>
+            <w:tcMar>
+              <w:left w:w="58" w:type="dxa"/>
+              <w:right w:w="58" w:type="dxa"/>
+            </w:tcMar>
+          </w:tcPr>
+          <w:p>
+            <w:pPr>
+              <w:keepNext/>
+              <w:spacing w:after="40" w:before="40" w:line="240" w:lineRule="auto"/>
+              <w:ind w:firstLine="0" w:left="0" w:right="0"/>
+              <w:jc w:val="left"/>
+            </w:pPr>
+            <w:r>
+              <w:rPr>
+                <w:rFonts w:ascii="Times New Roman" w:hAnsi="Times New Roman"/>
+                <w:b w:val="0"/>
+                <w:sz w:val="16"/>
+              </w:rPr>
+              <w:t>Key</w:t>
+            </w:r>
+          </w:p>
+        </w:tc>
+        <w:tc>
+          <w:tcPr>
+            <w:tcW w:type="dxa" w:w="3258"/>
+            <w:vAlign w:val="center"/>
+            <w:tcMar>
+              <w:left w:w="58" w:type="dxa"/>
+              <w:right w:w="58" w:type="dxa"/>
+            </w:tcMar>
+          </w:tcPr>
+          <w:p>
+            <w:pPr>
+              <w:keepNext/>
+              <w:spacing w:after="40" w:before="40" w:line="240" w:lineRule="auto"/>
+              <w:ind w:firstLine="0" w:left="0" w:right="0"/>
+              <w:jc w:val="left"/>
+            </w:pPr>
+            <w:r>
+              <w:rPr>
+                <w:rFonts w:ascii="Times New Roman" w:hAnsi="Times New Roman"/>
+                <w:b w:val="0"/>
+                <w:sz w:val="16"/>
+              </w:rPr>
+              <w:t>Month + source-checksum prefix + physical row ordinal; identity within the frozen file</w:t>
+            </w:r>
+          </w:p>
+        </w:tc>
+      </w:tr>
+      <w:tr>
+        <w:trPr>
+          <w:cantSplit/>
+        </w:trPr>
+        <w:tc>
+          <w:tcPr>
+            <w:tcW w:type="dxa" w:w="1086"/>
+            <w:vAlign w:val="center"/>
+            <w:tcMar>
+              <w:left w:w="58" w:type="dxa"/>
+              <w:right w:w="58" w:type="dxa"/>
+            </w:tcMar>
+          </w:tcPr>
+          <w:p>
+            <w:pPr>
+              <w:keepNext/>
+              <w:spacing w:after="40" w:before="40" w:line="240" w:lineRule="auto"/>
+              <w:ind w:firstLine="0" w:left="0" w:right="0"/>
+              <w:jc w:val="left"/>
+            </w:pPr>
+            <w:r>
+              <w:rPr>
+                <w:rFonts w:ascii="Times New Roman" w:hAnsi="Times New Roman"/>
+                <w:b w:val="0"/>
+                <w:sz w:val="16"/>
+              </w:rPr>
+              <w:t>Histories</w:t>
+            </w:r>
+          </w:p>
+        </w:tc>
+        <w:tc>
+          <w:tcPr>
+            <w:tcW w:type="dxa" w:w="3258"/>
+            <w:vAlign w:val="center"/>
+            <w:tcMar>
+              <w:left w:w="58" w:type="dxa"/>
+              <w:right w:w="58" w:type="dxa"/>
+            </w:tcMar>
+          </w:tcPr>
+          <w:p>
+            <w:pPr>
+              <w:keepNext/>
+              <w:spacing w:after="40" w:before="40" w:line="240" w:lineRule="auto"/>
+              <w:ind w:firstLine="0" w:left="0" w:right="0"/>
+              <w:jc w:val="left"/>
+            </w:pPr>
+            <w:r>
+              <w:rPr>
+                <w:rFonts w:ascii="Times New Roman" w:hAnsi="Times New Roman"/>
+                <w:b w:val="0"/>
+                <w:sz w:val="16"/>
+              </w:rPr>
+              <w:t>Generated fare/total corrections; 10 or 50 incremental commits; no observed release histories</w:t>
+            </w:r>
+          </w:p>
+        </w:tc>
+      </w:tr>
+      <w:tr>
+        <w:trPr>
+          <w:cantSplit/>
+        </w:trPr>
+        <w:tc>
+          <w:tcPr>
+            <w:tcW w:type="dxa" w:w="1086"/>
+            <w:vAlign w:val="center"/>
+            <w:tcMar>
+              <w:left w:w="58" w:type="dxa"/>
+              <w:right w:w="58" w:type="dxa"/>
+            </w:tcMar>
+          </w:tcPr>
+          <w:p>
+            <w:pPr>
+              <w:keepNext/>
+              <w:spacing w:after="40" w:before="40" w:line="240" w:lineRule="auto"/>
+              <w:ind w:firstLine="0" w:left="0" w:right="0"/>
+              <w:jc w:val="left"/>
+            </w:pPr>
+            <w:r>
+              <w:rPr>
+                <w:rFonts w:ascii="Times New Roman" w:hAnsi="Times New Roman"/>
+                <w:b w:val="0"/>
+                <w:sz w:val="16"/>
+              </w:rPr>
+              <w:t>Scale</w:t>
+            </w:r>
+          </w:p>
+        </w:tc>
+        <w:tc>
+          <w:tcPr>
+            <w:tcW w:type="dxa" w:w="3258"/>
+            <w:vAlign w:val="center"/>
+            <w:tcMar>
+              <w:left w:w="58" w:type="dxa"/>
+              <w:right w:w="58" w:type="dxa"/>
+            </w:tcMar>
+          </w:tcPr>
+          <w:p>
+            <w:pPr>
+              <w:keepNext/>
+              <w:spacing w:after="40" w:before="40" w:line="240" w:lineRule="auto"/>
+              <w:ind w:firstLine="0" w:left="0" w:right="0"/>
+              <w:jc w:val="left"/>
+            </w:pPr>
+            <w:r>
+              <w:rPr>
+                <w:rFonts w:ascii="Times New Roman" w:hAnsi="Times New Roman"/>
+                <w:b w:val="0"/>
+                <w:sz w:val="16"/>
+              </w:rPr>
+              <w:t>N=10k/100k/1M; H=10; C=10/100/1,000 per commit (0.1%)</w:t>
+            </w:r>
+          </w:p>
+        </w:tc>
+      </w:tr>
+      <w:tr>
+        <w:trPr>
+          <w:cantSplit/>
+        </w:trPr>
+        <w:tc>
+          <w:tcPr>
+            <w:tcW w:type="dxa" w:w="1086"/>
+            <w:vAlign w:val="center"/>
+            <w:tcMar>
+              <w:left w:w="58" w:type="dxa"/>
+              <w:right w:w="58" w:type="dxa"/>
+            </w:tcMar>
+          </w:tcPr>
+          <w:p>
+            <w:pPr>
+              <w:keepNext/>
+              <w:spacing w:after="40" w:before="40" w:line="240" w:lineRule="auto"/>
+              <w:ind w:firstLine="0" w:left="0" w:right="0"/>
+              <w:jc w:val="left"/>
+            </w:pPr>
+            <w:r>
+              <w:rPr>
+                <w:rFonts w:ascii="Times New Roman" w:hAnsi="Times New Roman"/>
+                <w:b w:val="0"/>
+                <w:sz w:val="16"/>
+              </w:rPr>
+              <w:t>History</w:t>
+            </w:r>
+          </w:p>
+        </w:tc>
+        <w:tc>
+          <w:tcPr>
+            <w:tcW w:type="dxa" w:w="3258"/>
+            <w:vAlign w:val="center"/>
+            <w:tcMar>
+              <w:left w:w="58" w:type="dxa"/>
+              <w:right w:w="58" w:type="dxa"/>
+            </w:tcMar>
+          </w:tcPr>
+          <w:p>
+            <w:pPr>
+              <w:keepNext/>
+              <w:spacing w:after="40" w:before="40" w:line="240" w:lineRule="auto"/>
+              <w:ind w:firstLine="0" w:left="0" w:right="0"/>
+              <w:jc w:val="left"/>
+            </w:pPr>
+            <w:r>
+              <w:rPr>
+                <w:rFonts w:ascii="Times New Roman" w:hAnsi="Times New Roman"/>
+                <w:b w:val="0"/>
+                <w:sz w:val="16"/>
+              </w:rPr>
+              <w:t>N=100k; H=10/50; C=100 per commit (0.1%)</w:t>
+            </w:r>
+          </w:p>
+        </w:tc>
+      </w:tr>
+      <w:tr>
+        <w:trPr>
+          <w:cantSplit/>
+        </w:trPr>
+        <w:tc>
+          <w:tcPr>
+            <w:tcW w:type="dxa" w:w="1086"/>
+            <w:vAlign w:val="center"/>
+            <w:tcMar>
+              <w:left w:w="58" w:type="dxa"/>
+              <w:right w:w="58" w:type="dxa"/>
+            </w:tcMar>
+          </w:tcPr>
+          <w:p>
+            <w:pPr>
+              <w:keepNext/>
+              <w:spacing w:after="40" w:before="40" w:line="240" w:lineRule="auto"/>
+              <w:ind w:firstLine="0" w:left="0" w:right="0"/>
+              <w:jc w:val="left"/>
+            </w:pPr>
+            <w:r>
+              <w:rPr>
+                <w:rFonts w:ascii="Times New Roman" w:hAnsi="Times New Roman"/>
+                <w:b w:val="0"/>
+                <w:sz w:val="16"/>
+              </w:rPr>
+              <w:t>Density</w:t>
+            </w:r>
+          </w:p>
+        </w:tc>
+        <w:tc>
+          <w:tcPr>
+            <w:tcW w:type="dxa" w:w="3258"/>
+            <w:vAlign w:val="center"/>
+            <w:tcMar>
+              <w:left w:w="58" w:type="dxa"/>
+              <w:right w:w="58" w:type="dxa"/>
+            </w:tcMar>
+          </w:tcPr>
+          <w:p>
+            <w:pPr>
+              <w:keepNext/>
+              <w:spacing w:after="40" w:before="40" w:line="240" w:lineRule="auto"/>
+              <w:ind w:firstLine="0" w:left="0" w:right="0"/>
+              <w:jc w:val="left"/>
+            </w:pPr>
+            <w:r>
+              <w:rPr>
+                <w:rFonts w:ascii="Times New Roman" w:hAnsi="Times New Roman"/>
+                <w:b w:val="0"/>
+                <w:sz w:val="16"/>
+              </w:rPr>
+              <w:t>N=100k; H=10; C=10/100/1,000 per commit (0.01%/0.1%/1%)</w:t>
+            </w:r>
+          </w:p>
+        </w:tc>
+      </w:tr>
+      <w:tr>
+        <w:trPr>
+          <w:cantSplit/>
+        </w:trPr>
+        <w:tc>
+          <w:tcPr>
+            <w:tcW w:type="dxa" w:w="1086"/>
+            <w:vAlign w:val="center"/>
+            <w:tcMar>
+              <w:left w:w="58" w:type="dxa"/>
+              <w:right w:w="58" w:type="dxa"/>
+            </w:tcMar>
+          </w:tcPr>
+          <w:p>
+            <w:pPr>
+              <w:keepNext w:val="0"/>
+              <w:spacing w:after="40" w:before="40" w:line="240" w:lineRule="auto"/>
+              <w:ind w:firstLine="0" w:left="0" w:right="0"/>
+              <w:jc w:val="left"/>
+            </w:pPr>
+            <w:r>
+              <w:rPr>
+                <w:rFonts w:ascii="Times New Roman" w:hAnsi="Times New Roman"/>
+                <w:b w:val="0"/>
+                <w:sz w:val="16"/>
+              </w:rPr>
+              <w:t>Sampling</w:t>
+            </w:r>
+          </w:p>
+        </w:tc>
+        <w:tc>
+          <w:tcPr>
+            <w:tcW w:type="dxa" w:w="3258"/>
+            <w:vAlign w:val="center"/>
+            <w:tcMar>
+              <w:left w:w="58" w:type="dxa"/>
+              <w:right w:w="58" w:type="dxa"/>
+            </w:tcMar>
+          </w:tcPr>
+          <w:p>
+            <w:pPr>
+              <w:keepNext w:val="0"/>
+              <w:spacing w:after="40" w:before="40" w:line="240" w:lineRule="auto"/>
+              <w:ind w:firstLine="0" w:left="0" w:right="0"/>
+              <w:jc w:val="left"/>
+            </w:pPr>
+            <w:r>
+              <w:rPr>
+                <w:rFonts w:ascii="Times New Roman" w:hAnsi="Times New Roman"/>
+                <w:b w:val="0"/>
+                <w:sz w:val="16"/>
+              </w:rPr>
+              <w:t>Seed 20261001; nested prefixes of a dispersed affine permutation; not a uniform random permutation</w:t>
+            </w:r>
+          </w:p>
+        </w:tc>
+      </w:tr>
+    </w:tbl>
+    <w:p>
+      <w:pPr>
         <w:pStyle w:val="Heading1"/>
         <w:keepNext/>
         <w:spacing w:before="140" w:after="60"/>
@@ -4514,7 +5217,7 @@
         </w:rPr>
         <w:drawing>
           <wp:inline distT="0" distB="0" distL="0" distR="0" wp14:anchorId="1311E863" wp14:editId="48B78019">
-            <wp:extent cx="3108960" cy="1767198"/>
+            <wp:extent cx="2758757" cy="1568135"/>
             <wp:effectExtent l="0" t="0" r="0" b="0"/>
             <wp:docPr id="4" name="Picture 4" descr="Log-scale grouped bar chart of final median diff latency with interquartile whiskers for Snapshot, Log-only, Revon-M, Revon-H, and Dolt across five workloads." title="Log-scale grouped bar chart of final median diff latency with interquartile whiskers for Snapshot, Log-only, Revon-M, Revon-H, and Dolt across five workloads"/>
             <wp:cNvGraphicFramePr>
@@ -4536,7 +5239,7 @@
                   <pic:spPr>
                     <a:xfrm>
                       <a:off x="0" y="0"/>
-                      <a:ext cx="3108960" cy="1767198"/>
+                      <a:ext cx="2758757" cy="1568135"/>
                     </a:xfrm>
                     <a:prstGeom prst="rect">
                       <a:avLst/>
@@ -4601,6 +5304,7 @@
           <w:cantSplit/>
           <w:tblHeader/>
           <w:jc w:val="center"/>
+          <w:cantSplit/>
         </w:trPr>
         <w:tc>
           <w:tcPr>
@@ -4622,6 +5326,7 @@
           </w:tcPr>
           <w:p>
             <w:pPr>
+              <w:keepNext/>
               <w:keepLines/>
             </w:pPr>
             <w:r>
@@ -4652,6 +5357,7 @@
           </w:tcPr>
           <w:p>
             <w:pPr>
+              <w:keepNext/>
               <w:keepLines/>
             </w:pPr>
             <w:r>
@@ -4682,6 +5388,7 @@
           </w:tcPr>
           <w:p>
             <w:pPr>
+              <w:keepNext/>
               <w:keepLines/>
             </w:pPr>
             <w:r>
@@ -4712,6 +5419,7 @@
           </w:tcPr>
           <w:p>
             <w:pPr>
+              <w:keepNext/>
               <w:keepLines/>
             </w:pPr>
             <w:r>
@@ -4742,6 +5450,7 @@
           </w:tcPr>
           <w:p>
             <w:pPr>
+              <w:keepNext/>
               <w:keepLines/>
             </w:pPr>
             <w:r>
@@ -4757,6 +5466,7 @@
         <w:trPr>
           <w:cantSplit/>
           <w:jc w:val="center"/>
+          <w:cantSplit/>
         </w:trPr>
         <w:tc>
           <w:tcPr>
@@ -4933,6 +5643,7 @@
         <w:trPr>
           <w:cantSplit/>
           <w:jc w:val="center"/>
+          <w:cantSplit/>
         </w:trPr>
         <w:tc>
           <w:tcPr>
@@ -5109,6 +5820,7 @@
         <w:trPr>
           <w:cantSplit/>
           <w:jc w:val="center"/>
+          <w:cantSplit/>
         </w:trPr>
         <w:tc>
           <w:tcPr>
@@ -5285,6 +5997,7 @@
         <w:trPr>
           <w:cantSplit/>
           <w:jc w:val="center"/>
+          <w:cantSplit/>
         </w:trPr>
         <w:tc>
           <w:tcPr>
@@ -5461,6 +6174,7 @@
         <w:trPr>
           <w:cantSplit/>
           <w:jc w:val="center"/>
+          <w:cantSplit/>
         </w:trPr>
         <w:tc>
           <w:tcPr>
@@ -5637,6 +6351,7 @@
         <w:trPr>
           <w:cantSplit/>
           <w:jc w:val="center"/>
+          <w:cantSplit/>
         </w:trPr>
         <w:tc>
           <w:tcPr>
@@ -5813,6 +6528,7 @@
         <w:trPr>
           <w:cantSplit/>
           <w:jc w:val="center"/>
+          <w:cantSplit/>
         </w:trPr>
         <w:tc>
           <w:tcPr>
@@ -5989,6 +6705,7 @@
         <w:trPr>
           <w:cantSplit/>
           <w:jc w:val="center"/>
+          <w:cantSplit/>
         </w:trPr>
         <w:tc>
           <w:tcPr>
@@ -6172,7 +6889,7 @@
         <w:jc w:val="center"/>
       </w:pPr>
       <w:r>
-        <w:t>TABLE III. Revon-H and SQL-path Dolt diff latency; the final column gives the median paired ratio and 95% bootstrap interval.</w:t>
+        <w:t>TABLE IV. Revon-H and SQL-path Dolt diff latency; the final column gives the median paired ratio and 95% bootstrap interval.</w:t>
       </w:r>
     </w:p>
     <w:p>
@@ -6197,7 +6914,7 @@
         <w:jc w:val="both"/>
       </w:pPr>
       <w:r>
-        <w:t>In all eight scenarios, the paired Dolt/Revon-H diff ratio exceeded one and its 95% interval excluded parity. Revon-H therefore had lower diff latency in the workflows we tested. Table III gives the median of the seven same-trial ratios and the bootstrap interval. The comparison is between Revon’s in-process API and Dolt’s CLI workflow, which includes Dolt CLI and SQL costs; these ratios are not engine-only speedups. The lexically adjacent application-key workload is distinct from the range-local, repeated-key, and hash-route-local workloads.</w:t>
+        <w:t>In all eight scenarios, the paired Dolt/Revon-H diff ratio exceeded one and its 95% interval excluded parity. Revon-H therefore had lower diff latency in the workflows we tested. Table IV gives the median of the seven same-trial ratios and the bootstrap interval. The comparison is between Revon’s in-process API and Dolt’s CLI workflow, which includes Dolt CLI and SQL costs; these ratios are not engine-only speedups. The lexically adjacent application-key workload is distinct from the range-local, repeated-key, and hash-route-local workloads.</w:t>
       </w:r>
     </w:p>
     <w:p>
@@ -6275,7 +6992,7 @@
         </w:rPr>
         <w:drawing>
           <wp:inline distT="0" distB="0" distL="0" distR="0" wp14:anchorId="5480C593" wp14:editId="6B287AB5">
-            <wp:extent cx="3108960" cy="1603568"/>
+            <wp:extent cx="2758757" cy="1422937"/>
             <wp:effectExtent l="0" t="0" r="0" b="0"/>
             <wp:docPr id="5" name="Picture 5" descr="Two-panel log-scale chart comparing Revon-H and Dolt median incremental commit and historical checkout latency with interquartile whiskers." title="Two-panel log-scale chart comparing Revon-H and Dolt median incremental commit and historical checkout latency with interquartile whiskers"/>
             <wp:cNvGraphicFramePr>
@@ -6297,7 +7014,7 @@
                   <pic:spPr>
                     <a:xfrm>
                       <a:off x="0" y="0"/>
-                      <a:ext cx="3108960" cy="1603568"/>
+                      <a:ext cx="2758757" cy="1422937"/>
                     </a:xfrm>
                     <a:prstGeom prst="rect">
                       <a:avLst/>
@@ -6392,7 +7109,7 @@
         </w:rPr>
         <w:drawing>
           <wp:inline distT="0" distB="0" distL="0" distR="0" wp14:anchorId="0AF85796" wp14:editId="7444C345">
-            <wp:extent cx="3063240" cy="1723072"/>
+            <wp:extent cx="2758757" cy="1551800"/>
             <wp:effectExtent l="0" t="0" r="0" b="0"/>
             <wp:docPr id="6" name="Picture 6" descr="Scatter plot of forced-Merkle median diff latency against repository storage for five branching-factor and depth configurations, highlighting b8-d4." title="Scatter plot of forced-Merkle median diff latency against repository storage for five branching-factor and depth configurations, highlighting b8-d4"/>
             <wp:cNvGraphicFramePr>
@@ -6414,7 +7131,7 @@
                   <pic:spPr>
                     <a:xfrm>
                       <a:off x="0" y="0"/>
-                      <a:ext cx="3063240" cy="1723072"/>
+                      <a:ext cx="2758757" cy="1551800"/>
                     </a:xfrm>
                     <a:prstGeom prst="rect">
                       <a:avLst/>
@@ -6453,6 +7170,3552 @@
     </w:p>
     <w:p>
       <w:pPr>
+        <w:pStyle w:val="Heading2"/>
+        <w:keepNext/>
+        <w:pageBreakBefore w:val="0"/>
+        <w:spacing w:before="140" w:after="60"/>
+        <w:ind w:firstLine="0"/>
+        <w:jc w:val="left"/>
+      </w:pPr>
+      <w:r>
+        <w:rPr>
+          <w:rFonts w:ascii="Times New Roman" w:hAnsi="Times New Roman" w:cs="Times New Roman" w:eastAsia="Times New Roman"/>
+          <w:b/>
+          <w:sz w:val="22"/>
+        </w:rPr>
+        <w:t>5.5 Public Dataset Scale History and Update Density</w:t>
+      </w:r>
+    </w:p>
+    <w:p>
+      <w:pPr>
+        <w:keepNext/>
+        <w:keepLines/>
+        <w:pageBreakBefore w:val="0"/>
+        <w:spacing w:line="240" w:lineRule="auto" w:after="0" w:before="0"/>
+        <w:ind w:firstLine="0" w:left="0" w:right="0"/>
+        <w:jc w:val="center"/>
+      </w:pPr>
+      <w:r/>
+      <w:r>
+        <w:drawing>
+          <wp:inline xmlns:a="http://schemas.openxmlformats.org/drawingml/2006/main" xmlns:pic="http://schemas.openxmlformats.org/drawingml/2006/picture">
+            <wp:extent cx="2758757" cy="5349855"/>
+            <wp:docPr id="7" name="Picture 7"/>
+            <wp:cNvGraphicFramePr>
+              <a:graphicFrameLocks noChangeAspect="1"/>
+            </wp:cNvGraphicFramePr>
+            <a:graphic>
+              <a:graphicData uri="http://schemas.openxmlformats.org/drawingml/2006/picture">
+                <pic:pic>
+                  <pic:nvPicPr>
+                    <pic:cNvPr id="0" name="public_dataset_scale_3.017.png"/>
+                    <pic:cNvPicPr/>
+                  </pic:nvPicPr>
+                  <pic:blipFill>
+                    <a:blip r:embed="rId39"/>
+                    <a:stretch>
+                      <a:fillRect/>
+                    </a:stretch>
+                  </pic:blipFill>
+                  <pic:spPr>
+                    <a:xfrm>
+                      <a:off x="0" y="0"/>
+                      <a:ext cx="2758757" cy="5349855"/>
+                    </a:xfrm>
+                    <a:prstGeom prst="rect"/>
+                  </pic:spPr>
+                </pic:pic>
+              </a:graphicData>
+            </a:graphic>
+          </wp:inline>
+        </w:drawing>
+      </w:r>
+    </w:p>
+    <w:p>
+      <w:pPr>
+        <w:pStyle w:val="Caption"/>
+        <w:keepNext w:val="0"/>
+        <w:keepLines/>
+        <w:pageBreakBefore w:val="0"/>
+        <w:spacing w:before="40" w:after="40" w:line="240" w:lineRule="exact"/>
+        <w:ind w:firstLine="0"/>
+        <w:jc w:val="center"/>
+      </w:pPr>
+      <w:r>
+        <w:t>Fig. 7. Public-record scalability with ten generated commits and 0.1% updates per commit; medians and interquartile ranges (seven successful measured trials per configuration). Both axes use logarithmic scales. Revon-H uses log diff at 10k/100k and Merkle diff at 1M.</w:t>
+      </w:r>
+    </w:p>
+    <w:p>
+      <w:pPr>
+        <w:keepNext w:val="0"/>
+        <w:pageBreakBefore w:val="0"/>
+        <w:spacing w:line="272" w:lineRule="exact" w:after="0"/>
+        <w:ind w:firstLine="216"/>
+        <w:jc w:val="both"/>
+      </w:pPr>
+      <w:r>
+        <w:t>At one million records, Revon-H's median incremental commit was 4764.26 [3086.15, 5159.49] ms and its initial-to-final diff was 651.01 [448.66, 693.13] ms. Its median repository footprint was 1446.69 MiB. Both Revon variants selected Merkle differencing for the 10,000 accumulated operations at one million records; this configuration does not test a log-path benefit. Revon-H's incremental-commit median exceeded those of Snapshot, Log-only, Dolt SQL, Dolt CSV at this scale.</w:t>
+      </w:r>
+    </w:p>
+    <w:p>
+      <w:pPr>
+        <w:keepNext w:val="0"/>
+        <w:pageBreakBefore w:val="0"/>
+        <w:spacing w:line="272" w:lineRule="exact" w:after="0"/>
+        <w:ind w:firstLine="216"/>
+        <w:jc w:val="both"/>
+      </w:pPr>
+      <w:r>
+        <w:t>Initial import for Revon-H took 39.60 [27.54, 41.41] s, compared with 29.02 [20.93, 37.70] s for Dolt SQL and 24.94 [20.11, 27.29] s for Dolt CSV import. These initial loads are separate from incremental commits. The ratio of median Revon-H/Dolt SQL repository footprints was 10.90; this includes serialization, indexes and compression effects and is not a pure metadata comparison.</w:t>
+      </w:r>
+    </w:p>
+    <w:p>
+      <w:pPr>
+        <w:keepNext w:val="0"/>
+        <w:pageBreakBefore w:val="0"/>
+        <w:spacing w:line="272" w:lineRule="exact" w:after="0"/>
+        <w:ind w:firstLine="216"/>
+        <w:jc w:val="both"/>
+      </w:pPr>
+      <w:r>
+        <w:t>Brackets give the interquartile range across measured trial summaries, not confidence intervals or variation across datasets. Full import, checkout, storage and failure records remain in the evidence bundle.</w:t>
+      </w:r>
+    </w:p>
+    <w:p>
+      <w:pPr>
+        <w:keepNext w:val="0"/>
+        <w:pageBreakBefore w:val="0"/>
+        <w:spacing w:line="272" w:lineRule="exact" w:after="0"/>
+        <w:ind w:firstLine="216"/>
+        <w:jc w:val="both"/>
+      </w:pPr>
+      <w:r>
+        <w:t>Failed executions are retained and excluded from performance summaries. One interrupted million-record Revon-M attempt was followed by a fresh recovery trial after the matrix, under identical frozen source and workload. Seven successful measured trials enter each summary; the failed attempt remains in the original bundle. The recovery was outside the counterbalanced block and host memory conditions were not held constant.</w:t>
+      </w:r>
+    </w:p>
+    <w:p>
+      <w:pPr>
+        <w:pStyle w:val="Caption"/>
+        <w:keepNext/>
+        <w:keepLines/>
+        <w:pageBreakBefore w:val="0"/>
+        <w:spacing w:before="40" w:after="40" w:line="240" w:lineRule="exact"/>
+        <w:ind w:firstLine="0"/>
+        <w:jc w:val="center"/>
+      </w:pPr>
+      <w:r>
+        <w:t>TABLE V. Public-data history and density results at 100,000 records; median commit and diff times in ms and footprint in MiB. Full interquartile ranges are retained in summary.csv.</w:t>
+      </w:r>
+    </w:p>
+    <w:tbl>
+      <w:tblPr>
+        <w:tblW w:type="auto" w:w="0"/>
+        <w:tblLayout w:type="fixed"/>
+        <w:tblLook w:firstColumn="1" w:firstRow="1" w:lastColumn="0" w:lastRow="0" w:noHBand="0" w:noVBand="1" w:val="04A0"/>
+        <w:tblBorders>
+          <w:top w:val="single" w:sz="4" w:color="B6BEC5"/>
+          <w:bottom w:val="single" w:sz="4" w:color="B6BEC5"/>
+          <w:insideH w:val="single" w:sz="4" w:color="B6BEC5"/>
+        </w:tblBorders>
+      </w:tblPr>
+      <w:tblGrid>
+        <w:gridCol w:w="1043"/>
+        <w:gridCol w:w="1086"/>
+        <w:gridCol w:w="782"/>
+        <w:gridCol w:w="695"/>
+        <w:gridCol w:w="739"/>
+      </w:tblGrid>
+      <w:tr>
+        <w:trPr>
+          <w:cantSplit/>
+          <w:tblHeader/>
+        </w:trPr>
+        <w:tc>
+          <w:tcPr>
+            <w:tcW w:type="dxa" w:w="1043"/>
+            <w:vAlign w:val="center"/>
+            <w:tcMar>
+              <w:left w:w="58" w:type="dxa"/>
+              <w:right w:w="58" w:type="dxa"/>
+            </w:tcMar>
+          </w:tcPr>
+          <w:p>
+            <w:pPr>
+              <w:keepNext/>
+              <w:spacing w:after="40" w:before="40" w:line="240" w:lineRule="auto"/>
+              <w:ind w:firstLine="0" w:left="0" w:right="0"/>
+              <w:jc w:val="left"/>
+            </w:pPr>
+            <w:r>
+              <w:rPr>
+                <w:rFonts w:ascii="Times New Roman" w:hAnsi="Times New Roman"/>
+                <w:b/>
+                <w:sz w:val="16"/>
+              </w:rPr>
+              <w:t>H / density</w:t>
+            </w:r>
+          </w:p>
+        </w:tc>
+        <w:tc>
+          <w:tcPr>
+            <w:tcW w:type="dxa" w:w="1086"/>
+            <w:vAlign w:val="center"/>
+            <w:tcMar>
+              <w:left w:w="58" w:type="dxa"/>
+              <w:right w:w="58" w:type="dxa"/>
+            </w:tcMar>
+          </w:tcPr>
+          <w:p>
+            <w:pPr>
+              <w:keepNext/>
+              <w:spacing w:after="40" w:before="40" w:line="240" w:lineRule="auto"/>
+              <w:ind w:firstLine="0" w:left="0" w:right="0"/>
+              <w:jc w:val="left"/>
+            </w:pPr>
+            <w:r>
+              <w:rPr>
+                <w:rFonts w:ascii="Times New Roman" w:hAnsi="Times New Roman"/>
+                <w:b/>
+                <w:sz w:val="16"/>
+              </w:rPr>
+              <w:t>System</w:t>
+            </w:r>
+          </w:p>
+        </w:tc>
+        <w:tc>
+          <w:tcPr>
+            <w:tcW w:type="dxa" w:w="782"/>
+            <w:vAlign w:val="center"/>
+            <w:tcMar>
+              <w:left w:w="58" w:type="dxa"/>
+              <w:right w:w="58" w:type="dxa"/>
+            </w:tcMar>
+          </w:tcPr>
+          <w:p>
+            <w:pPr>
+              <w:keepNext/>
+              <w:spacing w:after="40" w:before="40" w:line="240" w:lineRule="auto"/>
+              <w:ind w:firstLine="0" w:left="0" w:right="0"/>
+              <w:jc w:val="left"/>
+            </w:pPr>
+            <w:r>
+              <w:rPr>
+                <w:rFonts w:ascii="Times New Roman" w:hAnsi="Times New Roman"/>
+                <w:b/>
+                <w:sz w:val="16"/>
+              </w:rPr>
+              <w:t>Commit</w:t>
+            </w:r>
+          </w:p>
+        </w:tc>
+        <w:tc>
+          <w:tcPr>
+            <w:tcW w:type="dxa" w:w="695"/>
+            <w:vAlign w:val="center"/>
+            <w:tcMar>
+              <w:left w:w="58" w:type="dxa"/>
+              <w:right w:w="58" w:type="dxa"/>
+            </w:tcMar>
+          </w:tcPr>
+          <w:p>
+            <w:pPr>
+              <w:keepNext/>
+              <w:spacing w:after="40" w:before="40" w:line="240" w:lineRule="auto"/>
+              <w:ind w:firstLine="0" w:left="0" w:right="0"/>
+              <w:jc w:val="left"/>
+            </w:pPr>
+            <w:r>
+              <w:rPr>
+                <w:rFonts w:ascii="Times New Roman" w:hAnsi="Times New Roman"/>
+                <w:b/>
+                <w:sz w:val="16"/>
+              </w:rPr>
+              <w:t>Diff</w:t>
+            </w:r>
+          </w:p>
+        </w:tc>
+        <w:tc>
+          <w:tcPr>
+            <w:tcW w:type="dxa" w:w="739"/>
+            <w:vAlign w:val="center"/>
+            <w:tcMar>
+              <w:left w:w="58" w:type="dxa"/>
+              <w:right w:w="58" w:type="dxa"/>
+            </w:tcMar>
+          </w:tcPr>
+          <w:p>
+            <w:pPr>
+              <w:keepNext/>
+              <w:spacing w:after="40" w:before="40" w:line="240" w:lineRule="auto"/>
+              <w:ind w:firstLine="0" w:left="0" w:right="0"/>
+              <w:jc w:val="left"/>
+            </w:pPr>
+            <w:r>
+              <w:rPr>
+                <w:rFonts w:ascii="Times New Roman" w:hAnsi="Times New Roman"/>
+                <w:b/>
+                <w:sz w:val="16"/>
+              </w:rPr>
+              <w:t>MiB</w:t>
+            </w:r>
+          </w:p>
+        </w:tc>
+      </w:tr>
+      <w:tr>
+        <w:trPr>
+          <w:cantSplit/>
+        </w:trPr>
+        <w:tc>
+          <w:tcPr>
+            <w:tcW w:type="dxa" w:w="1043"/>
+            <w:vAlign w:val="center"/>
+            <w:tcMar>
+              <w:left w:w="58" w:type="dxa"/>
+              <w:right w:w="58" w:type="dxa"/>
+            </w:tcMar>
+          </w:tcPr>
+          <w:p>
+            <w:pPr>
+              <w:keepNext/>
+              <w:spacing w:after="40" w:before="40" w:line="240" w:lineRule="auto"/>
+              <w:ind w:firstLine="0" w:left="0" w:right="0"/>
+              <w:jc w:val="left"/>
+            </w:pPr>
+            <w:r>
+              <w:rPr>
+                <w:rFonts w:ascii="Times New Roman" w:hAnsi="Times New Roman"/>
+                <w:b w:val="0"/>
+                <w:sz w:val="16"/>
+              </w:rPr>
+              <w:t>10 / 0.1%</w:t>
+            </w:r>
+          </w:p>
+        </w:tc>
+        <w:tc>
+          <w:tcPr>
+            <w:tcW w:type="dxa" w:w="1086"/>
+            <w:vAlign w:val="center"/>
+            <w:tcMar>
+              <w:left w:w="58" w:type="dxa"/>
+              <w:right w:w="58" w:type="dxa"/>
+            </w:tcMar>
+          </w:tcPr>
+          <w:p>
+            <w:pPr>
+              <w:keepNext/>
+              <w:spacing w:after="40" w:before="40" w:line="240" w:lineRule="auto"/>
+              <w:ind w:firstLine="0" w:left="0" w:right="0"/>
+              <w:jc w:val="left"/>
+            </w:pPr>
+            <w:r>
+              <w:rPr>
+                <w:rFonts w:ascii="Times New Roman" w:hAnsi="Times New Roman"/>
+                <w:b w:val="0"/>
+                <w:sz w:val="16"/>
+              </w:rPr>
+              <w:t>Snapshot</w:t>
+            </w:r>
+          </w:p>
+        </w:tc>
+        <w:tc>
+          <w:tcPr>
+            <w:tcW w:type="dxa" w:w="782"/>
+            <w:vAlign w:val="center"/>
+            <w:tcMar>
+              <w:left w:w="58" w:type="dxa"/>
+              <w:right w:w="58" w:type="dxa"/>
+            </w:tcMar>
+          </w:tcPr>
+          <w:p>
+            <w:pPr>
+              <w:keepNext/>
+              <w:spacing w:after="40" w:before="40" w:line="240" w:lineRule="auto"/>
+              <w:ind w:firstLine="0" w:left="0" w:right="0"/>
+              <w:jc w:val="right"/>
+            </w:pPr>
+            <w:r>
+              <w:rPr>
+                <w:rFonts w:ascii="Times New Roman" w:hAnsi="Times New Roman"/>
+                <w:b w:val="0"/>
+                <w:sz w:val="16"/>
+              </w:rPr>
+              <w:t>257.41</w:t>
+            </w:r>
+          </w:p>
+        </w:tc>
+        <w:tc>
+          <w:tcPr>
+            <w:tcW w:type="dxa" w:w="695"/>
+            <w:vAlign w:val="center"/>
+            <w:tcMar>
+              <w:left w:w="58" w:type="dxa"/>
+              <w:right w:w="58" w:type="dxa"/>
+            </w:tcMar>
+          </w:tcPr>
+          <w:p>
+            <w:pPr>
+              <w:keepNext/>
+              <w:spacing w:after="40" w:before="40" w:line="240" w:lineRule="auto"/>
+              <w:ind w:firstLine="0" w:left="0" w:right="0"/>
+              <w:jc w:val="right"/>
+            </w:pPr>
+            <w:r>
+              <w:rPr>
+                <w:rFonts w:ascii="Times New Roman" w:hAnsi="Times New Roman"/>
+                <w:b w:val="0"/>
+                <w:sz w:val="16"/>
+              </w:rPr>
+              <w:t>1584.12</w:t>
+            </w:r>
+          </w:p>
+        </w:tc>
+        <w:tc>
+          <w:tcPr>
+            <w:tcW w:type="dxa" w:w="739"/>
+            <w:vAlign w:val="center"/>
+            <w:tcMar>
+              <w:left w:w="58" w:type="dxa"/>
+              <w:right w:w="58" w:type="dxa"/>
+            </w:tcMar>
+          </w:tcPr>
+          <w:p>
+            <w:pPr>
+              <w:keepNext/>
+              <w:spacing w:after="40" w:before="40" w:line="240" w:lineRule="auto"/>
+              <w:ind w:firstLine="0" w:left="0" w:right="0"/>
+              <w:jc w:val="right"/>
+            </w:pPr>
+            <w:r>
+              <w:rPr>
+                <w:rFonts w:ascii="Times New Roman" w:hAnsi="Times New Roman"/>
+                <w:b w:val="0"/>
+                <w:sz w:val="16"/>
+              </w:rPr>
+              <w:t>354.91</w:t>
+            </w:r>
+          </w:p>
+        </w:tc>
+      </w:tr>
+      <w:tr>
+        <w:trPr>
+          <w:cantSplit/>
+        </w:trPr>
+        <w:tc>
+          <w:tcPr>
+            <w:tcW w:type="dxa" w:w="1043"/>
+            <w:vAlign w:val="center"/>
+            <w:tcMar>
+              <w:left w:w="58" w:type="dxa"/>
+              <w:right w:w="58" w:type="dxa"/>
+            </w:tcMar>
+          </w:tcPr>
+          <w:p>
+            <w:pPr>
+              <w:keepNext/>
+              <w:spacing w:after="40" w:before="40" w:line="240" w:lineRule="auto"/>
+              <w:ind w:firstLine="0" w:left="0" w:right="0"/>
+              <w:jc w:val="left"/>
+            </w:pPr>
+            <w:r>
+              <w:rPr>
+                <w:rFonts w:ascii="Times New Roman" w:hAnsi="Times New Roman"/>
+                <w:b w:val="0"/>
+                <w:sz w:val="16"/>
+              </w:rPr>
+              <w:t>10 / 0.1%</w:t>
+            </w:r>
+          </w:p>
+        </w:tc>
+        <w:tc>
+          <w:tcPr>
+            <w:tcW w:type="dxa" w:w="1086"/>
+            <w:vAlign w:val="center"/>
+            <w:tcMar>
+              <w:left w:w="58" w:type="dxa"/>
+              <w:right w:w="58" w:type="dxa"/>
+            </w:tcMar>
+          </w:tcPr>
+          <w:p>
+            <w:pPr>
+              <w:keepNext/>
+              <w:spacing w:after="40" w:before="40" w:line="240" w:lineRule="auto"/>
+              <w:ind w:firstLine="0" w:left="0" w:right="0"/>
+              <w:jc w:val="left"/>
+            </w:pPr>
+            <w:r>
+              <w:rPr>
+                <w:rFonts w:ascii="Times New Roman" w:hAnsi="Times New Roman"/>
+                <w:b w:val="0"/>
+                <w:sz w:val="16"/>
+              </w:rPr>
+              <w:t>Log-only</w:t>
+            </w:r>
+          </w:p>
+        </w:tc>
+        <w:tc>
+          <w:tcPr>
+            <w:tcW w:type="dxa" w:w="782"/>
+            <w:vAlign w:val="center"/>
+            <w:tcMar>
+              <w:left w:w="58" w:type="dxa"/>
+              <w:right w:w="58" w:type="dxa"/>
+            </w:tcMar>
+          </w:tcPr>
+          <w:p>
+            <w:pPr>
+              <w:keepNext/>
+              <w:spacing w:after="40" w:before="40" w:line="240" w:lineRule="auto"/>
+              <w:ind w:firstLine="0" w:left="0" w:right="0"/>
+              <w:jc w:val="right"/>
+            </w:pPr>
+            <w:r>
+              <w:rPr>
+                <w:rFonts w:ascii="Times New Roman" w:hAnsi="Times New Roman"/>
+                <w:b w:val="0"/>
+                <w:sz w:val="16"/>
+              </w:rPr>
+              <w:t>4.11</w:t>
+            </w:r>
+          </w:p>
+        </w:tc>
+        <w:tc>
+          <w:tcPr>
+            <w:tcW w:type="dxa" w:w="695"/>
+            <w:vAlign w:val="center"/>
+            <w:tcMar>
+              <w:left w:w="58" w:type="dxa"/>
+              <w:right w:w="58" w:type="dxa"/>
+            </w:tcMar>
+          </w:tcPr>
+          <w:p>
+            <w:pPr>
+              <w:keepNext/>
+              <w:spacing w:after="40" w:before="40" w:line="240" w:lineRule="auto"/>
+              <w:ind w:firstLine="0" w:left="0" w:right="0"/>
+              <w:jc w:val="right"/>
+            </w:pPr>
+            <w:r>
+              <w:rPr>
+                <w:rFonts w:ascii="Times New Roman" w:hAnsi="Times New Roman"/>
+                <w:b w:val="0"/>
+                <w:sz w:val="16"/>
+              </w:rPr>
+              <w:t>29.62</w:t>
+            </w:r>
+          </w:p>
+        </w:tc>
+        <w:tc>
+          <w:tcPr>
+            <w:tcW w:type="dxa" w:w="739"/>
+            <w:vAlign w:val="center"/>
+            <w:tcMar>
+              <w:left w:w="58" w:type="dxa"/>
+              <w:right w:w="58" w:type="dxa"/>
+            </w:tcMar>
+          </w:tcPr>
+          <w:p>
+            <w:pPr>
+              <w:keepNext/>
+              <w:spacing w:after="40" w:before="40" w:line="240" w:lineRule="auto"/>
+              <w:ind w:firstLine="0" w:left="0" w:right="0"/>
+              <w:jc w:val="right"/>
+            </w:pPr>
+            <w:r>
+              <w:rPr>
+                <w:rFonts w:ascii="Times New Roman" w:hAnsi="Times New Roman"/>
+                <w:b w:val="0"/>
+                <w:sz w:val="16"/>
+              </w:rPr>
+              <w:t>32.93</w:t>
+            </w:r>
+          </w:p>
+        </w:tc>
+      </w:tr>
+      <w:tr>
+        <w:trPr>
+          <w:cantSplit/>
+        </w:trPr>
+        <w:tc>
+          <w:tcPr>
+            <w:tcW w:type="dxa" w:w="1043"/>
+            <w:vAlign w:val="center"/>
+            <w:tcMar>
+              <w:left w:w="58" w:type="dxa"/>
+              <w:right w:w="58" w:type="dxa"/>
+            </w:tcMar>
+          </w:tcPr>
+          <w:p>
+            <w:pPr>
+              <w:keepNext/>
+              <w:spacing w:after="40" w:before="40" w:line="240" w:lineRule="auto"/>
+              <w:ind w:firstLine="0" w:left="0" w:right="0"/>
+              <w:jc w:val="left"/>
+            </w:pPr>
+            <w:r>
+              <w:rPr>
+                <w:rFonts w:ascii="Times New Roman" w:hAnsi="Times New Roman"/>
+                <w:b w:val="0"/>
+                <w:sz w:val="16"/>
+              </w:rPr>
+              <w:t>10 / 0.1%</w:t>
+            </w:r>
+          </w:p>
+        </w:tc>
+        <w:tc>
+          <w:tcPr>
+            <w:tcW w:type="dxa" w:w="1086"/>
+            <w:vAlign w:val="center"/>
+            <w:tcMar>
+              <w:left w:w="58" w:type="dxa"/>
+              <w:right w:w="58" w:type="dxa"/>
+            </w:tcMar>
+          </w:tcPr>
+          <w:p>
+            <w:pPr>
+              <w:keepNext/>
+              <w:spacing w:after="40" w:before="40" w:line="240" w:lineRule="auto"/>
+              <w:ind w:firstLine="0" w:left="0" w:right="0"/>
+              <w:jc w:val="left"/>
+            </w:pPr>
+            <w:r>
+              <w:rPr>
+                <w:rFonts w:ascii="Times New Roman" w:hAnsi="Times New Roman"/>
+                <w:b w:val="0"/>
+                <w:sz w:val="16"/>
+              </w:rPr>
+              <w:t>Revon-M</w:t>
+            </w:r>
+          </w:p>
+        </w:tc>
+        <w:tc>
+          <w:tcPr>
+            <w:tcW w:type="dxa" w:w="782"/>
+            <w:vAlign w:val="center"/>
+            <w:tcMar>
+              <w:left w:w="58" w:type="dxa"/>
+              <w:right w:w="58" w:type="dxa"/>
+            </w:tcMar>
+          </w:tcPr>
+          <w:p>
+            <w:pPr>
+              <w:keepNext/>
+              <w:spacing w:after="40" w:before="40" w:line="240" w:lineRule="auto"/>
+              <w:ind w:firstLine="0" w:left="0" w:right="0"/>
+              <w:jc w:val="right"/>
+            </w:pPr>
+            <w:r>
+              <w:rPr>
+                <w:rFonts w:ascii="Times New Roman" w:hAnsi="Times New Roman"/>
+                <w:b w:val="0"/>
+                <w:sz w:val="16"/>
+              </w:rPr>
+              <w:t>202.78</w:t>
+            </w:r>
+          </w:p>
+        </w:tc>
+        <w:tc>
+          <w:tcPr>
+            <w:tcW w:type="dxa" w:w="695"/>
+            <w:vAlign w:val="center"/>
+            <w:tcMar>
+              <w:left w:w="58" w:type="dxa"/>
+              <w:right w:w="58" w:type="dxa"/>
+            </w:tcMar>
+          </w:tcPr>
+          <w:p>
+            <w:pPr>
+              <w:keepNext/>
+              <w:spacing w:after="40" w:before="40" w:line="240" w:lineRule="auto"/>
+              <w:ind w:firstLine="0" w:left="0" w:right="0"/>
+              <w:jc w:val="right"/>
+            </w:pPr>
+            <w:r>
+              <w:rPr>
+                <w:rFonts w:ascii="Times New Roman" w:hAnsi="Times New Roman"/>
+                <w:b w:val="0"/>
+                <w:sz w:val="16"/>
+              </w:rPr>
+              <w:t>25.95</w:t>
+            </w:r>
+          </w:p>
+        </w:tc>
+        <w:tc>
+          <w:tcPr>
+            <w:tcW w:type="dxa" w:w="739"/>
+            <w:vAlign w:val="center"/>
+            <w:tcMar>
+              <w:left w:w="58" w:type="dxa"/>
+              <w:right w:w="58" w:type="dxa"/>
+            </w:tcMar>
+          </w:tcPr>
+          <w:p>
+            <w:pPr>
+              <w:keepNext/>
+              <w:spacing w:after="40" w:before="40" w:line="240" w:lineRule="auto"/>
+              <w:ind w:firstLine="0" w:left="0" w:right="0"/>
+              <w:jc w:val="right"/>
+            </w:pPr>
+            <w:r>
+              <w:rPr>
+                <w:rFonts w:ascii="Times New Roman" w:hAnsi="Times New Roman"/>
+                <w:b w:val="0"/>
+                <w:sz w:val="16"/>
+              </w:rPr>
+              <w:t>90.03</w:t>
+            </w:r>
+          </w:p>
+        </w:tc>
+      </w:tr>
+      <w:tr>
+        <w:trPr>
+          <w:cantSplit/>
+        </w:trPr>
+        <w:tc>
+          <w:tcPr>
+            <w:tcW w:type="dxa" w:w="1043"/>
+            <w:vAlign w:val="center"/>
+            <w:tcMar>
+              <w:left w:w="58" w:type="dxa"/>
+              <w:right w:w="58" w:type="dxa"/>
+            </w:tcMar>
+          </w:tcPr>
+          <w:p>
+            <w:pPr>
+              <w:keepNext/>
+              <w:spacing w:after="40" w:before="40" w:line="240" w:lineRule="auto"/>
+              <w:ind w:firstLine="0" w:left="0" w:right="0"/>
+              <w:jc w:val="left"/>
+            </w:pPr>
+            <w:r>
+              <w:rPr>
+                <w:rFonts w:ascii="Times New Roman" w:hAnsi="Times New Roman"/>
+                <w:b w:val="0"/>
+                <w:sz w:val="16"/>
+              </w:rPr>
+              <w:t>10 / 0.1%</w:t>
+            </w:r>
+          </w:p>
+        </w:tc>
+        <w:tc>
+          <w:tcPr>
+            <w:tcW w:type="dxa" w:w="1086"/>
+            <w:vAlign w:val="center"/>
+            <w:tcMar>
+              <w:left w:w="58" w:type="dxa"/>
+              <w:right w:w="58" w:type="dxa"/>
+            </w:tcMar>
+          </w:tcPr>
+          <w:p>
+            <w:pPr>
+              <w:keepNext/>
+              <w:spacing w:after="40" w:before="40" w:line="240" w:lineRule="auto"/>
+              <w:ind w:firstLine="0" w:left="0" w:right="0"/>
+              <w:jc w:val="left"/>
+            </w:pPr>
+            <w:r>
+              <w:rPr>
+                <w:rFonts w:ascii="Times New Roman" w:hAnsi="Times New Roman"/>
+                <w:b w:val="0"/>
+                <w:sz w:val="16"/>
+              </w:rPr>
+              <w:t>Revon-H</w:t>
+            </w:r>
+          </w:p>
+        </w:tc>
+        <w:tc>
+          <w:tcPr>
+            <w:tcW w:type="dxa" w:w="782"/>
+            <w:vAlign w:val="center"/>
+            <w:tcMar>
+              <w:left w:w="58" w:type="dxa"/>
+              <w:right w:w="58" w:type="dxa"/>
+            </w:tcMar>
+          </w:tcPr>
+          <w:p>
+            <w:pPr>
+              <w:keepNext/>
+              <w:spacing w:after="40" w:before="40" w:line="240" w:lineRule="auto"/>
+              <w:ind w:firstLine="0" w:left="0" w:right="0"/>
+              <w:jc w:val="right"/>
+            </w:pPr>
+            <w:r>
+              <w:rPr>
+                <w:rFonts w:ascii="Times New Roman" w:hAnsi="Times New Roman"/>
+                <w:b w:val="0"/>
+                <w:sz w:val="16"/>
+              </w:rPr>
+              <w:t>161.09</w:t>
+            </w:r>
+          </w:p>
+        </w:tc>
+        <w:tc>
+          <w:tcPr>
+            <w:tcW w:type="dxa" w:w="695"/>
+            <w:vAlign w:val="center"/>
+            <w:tcMar>
+              <w:left w:w="58" w:type="dxa"/>
+              <w:right w:w="58" w:type="dxa"/>
+            </w:tcMar>
+          </w:tcPr>
+          <w:p>
+            <w:pPr>
+              <w:keepNext/>
+              <w:spacing w:after="40" w:before="40" w:line="240" w:lineRule="auto"/>
+              <w:ind w:firstLine="0" w:left="0" w:right="0"/>
+              <w:jc w:val="right"/>
+            </w:pPr>
+            <w:r>
+              <w:rPr>
+                <w:rFonts w:ascii="Times New Roman" w:hAnsi="Times New Roman"/>
+                <w:b w:val="0"/>
+                <w:sz w:val="16"/>
+              </w:rPr>
+              <w:t>8.65</w:t>
+            </w:r>
+          </w:p>
+        </w:tc>
+        <w:tc>
+          <w:tcPr>
+            <w:tcW w:type="dxa" w:w="739"/>
+            <w:vAlign w:val="center"/>
+            <w:tcMar>
+              <w:left w:w="58" w:type="dxa"/>
+              <w:right w:w="58" w:type="dxa"/>
+            </w:tcMar>
+          </w:tcPr>
+          <w:p>
+            <w:pPr>
+              <w:keepNext/>
+              <w:spacing w:after="40" w:before="40" w:line="240" w:lineRule="auto"/>
+              <w:ind w:firstLine="0" w:left="0" w:right="0"/>
+              <w:jc w:val="right"/>
+            </w:pPr>
+            <w:r>
+              <w:rPr>
+                <w:rFonts w:ascii="Times New Roman" w:hAnsi="Times New Roman"/>
+                <w:b w:val="0"/>
+                <w:sz w:val="16"/>
+              </w:rPr>
+              <w:t>90.04</w:t>
+            </w:r>
+          </w:p>
+        </w:tc>
+      </w:tr>
+      <w:tr>
+        <w:trPr>
+          <w:cantSplit/>
+        </w:trPr>
+        <w:tc>
+          <w:tcPr>
+            <w:tcW w:type="dxa" w:w="1043"/>
+            <w:vAlign w:val="center"/>
+            <w:tcMar>
+              <w:left w:w="58" w:type="dxa"/>
+              <w:right w:w="58" w:type="dxa"/>
+            </w:tcMar>
+          </w:tcPr>
+          <w:p>
+            <w:pPr>
+              <w:keepNext/>
+              <w:spacing w:after="40" w:before="40" w:line="240" w:lineRule="auto"/>
+              <w:ind w:firstLine="0" w:left="0" w:right="0"/>
+              <w:jc w:val="left"/>
+            </w:pPr>
+            <w:r>
+              <w:rPr>
+                <w:rFonts w:ascii="Times New Roman" w:hAnsi="Times New Roman"/>
+                <w:b w:val="0"/>
+                <w:sz w:val="16"/>
+              </w:rPr>
+              <w:t>10 / 0.1%</w:t>
+            </w:r>
+          </w:p>
+        </w:tc>
+        <w:tc>
+          <w:tcPr>
+            <w:tcW w:type="dxa" w:w="1086"/>
+            <w:vAlign w:val="center"/>
+            <w:tcMar>
+              <w:left w:w="58" w:type="dxa"/>
+              <w:right w:w="58" w:type="dxa"/>
+            </w:tcMar>
+          </w:tcPr>
+          <w:p>
+            <w:pPr>
+              <w:keepNext/>
+              <w:spacing w:after="40" w:before="40" w:line="240" w:lineRule="auto"/>
+              <w:ind w:firstLine="0" w:left="0" w:right="0"/>
+              <w:jc w:val="left"/>
+            </w:pPr>
+            <w:r>
+              <w:rPr>
+                <w:rFonts w:ascii="Times New Roman" w:hAnsi="Times New Roman"/>
+                <w:b w:val="0"/>
+                <w:sz w:val="16"/>
+              </w:rPr>
+              <w:t>Dolt SQL</w:t>
+            </w:r>
+          </w:p>
+        </w:tc>
+        <w:tc>
+          <w:tcPr>
+            <w:tcW w:type="dxa" w:w="782"/>
+            <w:vAlign w:val="center"/>
+            <w:tcMar>
+              <w:left w:w="58" w:type="dxa"/>
+              <w:right w:w="58" w:type="dxa"/>
+            </w:tcMar>
+          </w:tcPr>
+          <w:p>
+            <w:pPr>
+              <w:keepNext/>
+              <w:spacing w:after="40" w:before="40" w:line="240" w:lineRule="auto"/>
+              <w:ind w:firstLine="0" w:left="0" w:right="0"/>
+              <w:jc w:val="right"/>
+            </w:pPr>
+            <w:r>
+              <w:rPr>
+                <w:rFonts w:ascii="Times New Roman" w:hAnsi="Times New Roman"/>
+                <w:b w:val="0"/>
+                <w:sz w:val="16"/>
+              </w:rPr>
+              <w:t>749.08</w:t>
+            </w:r>
+          </w:p>
+        </w:tc>
+        <w:tc>
+          <w:tcPr>
+            <w:tcW w:type="dxa" w:w="695"/>
+            <w:vAlign w:val="center"/>
+            <w:tcMar>
+              <w:left w:w="58" w:type="dxa"/>
+              <w:right w:w="58" w:type="dxa"/>
+            </w:tcMar>
+          </w:tcPr>
+          <w:p>
+            <w:pPr>
+              <w:keepNext/>
+              <w:spacing w:after="40" w:before="40" w:line="240" w:lineRule="auto"/>
+              <w:ind w:firstLine="0" w:left="0" w:right="0"/>
+              <w:jc w:val="right"/>
+            </w:pPr>
+            <w:r>
+              <w:rPr>
+                <w:rFonts w:ascii="Times New Roman" w:hAnsi="Times New Roman"/>
+                <w:b w:val="0"/>
+                <w:sz w:val="16"/>
+              </w:rPr>
+              <w:t>329.10</w:t>
+            </w:r>
+          </w:p>
+        </w:tc>
+        <w:tc>
+          <w:tcPr>
+            <w:tcW w:type="dxa" w:w="739"/>
+            <w:vAlign w:val="center"/>
+            <w:tcMar>
+              <w:left w:w="58" w:type="dxa"/>
+              <w:right w:w="58" w:type="dxa"/>
+            </w:tcMar>
+          </w:tcPr>
+          <w:p>
+            <w:pPr>
+              <w:keepNext/>
+              <w:spacing w:after="40" w:before="40" w:line="240" w:lineRule="auto"/>
+              <w:ind w:firstLine="0" w:left="0" w:right="0"/>
+              <w:jc w:val="right"/>
+            </w:pPr>
+            <w:r>
+              <w:rPr>
+                <w:rFonts w:ascii="Times New Roman" w:hAnsi="Times New Roman"/>
+                <w:b w:val="0"/>
+                <w:sz w:val="16"/>
+              </w:rPr>
+              <w:t>13.50</w:t>
+            </w:r>
+          </w:p>
+        </w:tc>
+      </w:tr>
+      <w:tr>
+        <w:trPr>
+          <w:cantSplit/>
+        </w:trPr>
+        <w:tc>
+          <w:tcPr>
+            <w:tcW w:type="dxa" w:w="1043"/>
+            <w:vAlign w:val="center"/>
+            <w:tcMar>
+              <w:left w:w="58" w:type="dxa"/>
+              <w:right w:w="58" w:type="dxa"/>
+            </w:tcMar>
+          </w:tcPr>
+          <w:p>
+            <w:pPr>
+              <w:keepNext/>
+              <w:spacing w:after="40" w:before="40" w:line="240" w:lineRule="auto"/>
+              <w:ind w:firstLine="0" w:left="0" w:right="0"/>
+              <w:jc w:val="left"/>
+            </w:pPr>
+            <w:r>
+              <w:rPr>
+                <w:rFonts w:ascii="Times New Roman" w:hAnsi="Times New Roman"/>
+                <w:b w:val="0"/>
+                <w:sz w:val="16"/>
+              </w:rPr>
+              <w:t>10 / 0.1%</w:t>
+            </w:r>
+          </w:p>
+        </w:tc>
+        <w:tc>
+          <w:tcPr>
+            <w:tcW w:type="dxa" w:w="1086"/>
+            <w:vAlign w:val="center"/>
+            <w:tcMar>
+              <w:left w:w="58" w:type="dxa"/>
+              <w:right w:w="58" w:type="dxa"/>
+            </w:tcMar>
+          </w:tcPr>
+          <w:p>
+            <w:pPr>
+              <w:keepNext/>
+              <w:spacing w:after="40" w:before="40" w:line="240" w:lineRule="auto"/>
+              <w:ind w:firstLine="0" w:left="0" w:right="0"/>
+              <w:jc w:val="left"/>
+            </w:pPr>
+            <w:r>
+              <w:rPr>
+                <w:rFonts w:ascii="Times New Roman" w:hAnsi="Times New Roman"/>
+                <w:b w:val="0"/>
+                <w:sz w:val="16"/>
+              </w:rPr>
+              <w:t>Dolt CSV</w:t>
+            </w:r>
+          </w:p>
+        </w:tc>
+        <w:tc>
+          <w:tcPr>
+            <w:tcW w:type="dxa" w:w="782"/>
+            <w:vAlign w:val="center"/>
+            <w:tcMar>
+              <w:left w:w="58" w:type="dxa"/>
+              <w:right w:w="58" w:type="dxa"/>
+            </w:tcMar>
+          </w:tcPr>
+          <w:p>
+            <w:pPr>
+              <w:keepNext/>
+              <w:spacing w:after="40" w:before="40" w:line="240" w:lineRule="auto"/>
+              <w:ind w:firstLine="0" w:left="0" w:right="0"/>
+              <w:jc w:val="right"/>
+            </w:pPr>
+            <w:r>
+              <w:rPr>
+                <w:rFonts w:ascii="Times New Roman" w:hAnsi="Times New Roman"/>
+                <w:b w:val="0"/>
+                <w:sz w:val="16"/>
+              </w:rPr>
+              <w:t>716.78</w:t>
+            </w:r>
+          </w:p>
+        </w:tc>
+        <w:tc>
+          <w:tcPr>
+            <w:tcW w:type="dxa" w:w="695"/>
+            <w:vAlign w:val="center"/>
+            <w:tcMar>
+              <w:left w:w="58" w:type="dxa"/>
+              <w:right w:w="58" w:type="dxa"/>
+            </w:tcMar>
+          </w:tcPr>
+          <w:p>
+            <w:pPr>
+              <w:keepNext/>
+              <w:spacing w:after="40" w:before="40" w:line="240" w:lineRule="auto"/>
+              <w:ind w:firstLine="0" w:left="0" w:right="0"/>
+              <w:jc w:val="right"/>
+            </w:pPr>
+            <w:r>
+              <w:rPr>
+                <w:rFonts w:ascii="Times New Roman" w:hAnsi="Times New Roman"/>
+                <w:b w:val="0"/>
+                <w:sz w:val="16"/>
+              </w:rPr>
+              <w:t>327.17</w:t>
+            </w:r>
+          </w:p>
+        </w:tc>
+        <w:tc>
+          <w:tcPr>
+            <w:tcW w:type="dxa" w:w="739"/>
+            <w:vAlign w:val="center"/>
+            <w:tcMar>
+              <w:left w:w="58" w:type="dxa"/>
+              <w:right w:w="58" w:type="dxa"/>
+            </w:tcMar>
+          </w:tcPr>
+          <w:p>
+            <w:pPr>
+              <w:keepNext/>
+              <w:spacing w:after="40" w:before="40" w:line="240" w:lineRule="auto"/>
+              <w:ind w:firstLine="0" w:left="0" w:right="0"/>
+              <w:jc w:val="right"/>
+            </w:pPr>
+            <w:r>
+              <w:rPr>
+                <w:rFonts w:ascii="Times New Roman" w:hAnsi="Times New Roman"/>
+                <w:b w:val="0"/>
+                <w:sz w:val="16"/>
+              </w:rPr>
+              <w:t>12.95</w:t>
+            </w:r>
+          </w:p>
+        </w:tc>
+      </w:tr>
+      <w:tr>
+        <w:trPr>
+          <w:cantSplit/>
+        </w:trPr>
+        <w:tc>
+          <w:tcPr>
+            <w:tcW w:type="dxa" w:w="1043"/>
+            <w:vAlign w:val="center"/>
+            <w:tcMar>
+              <w:left w:w="58" w:type="dxa"/>
+              <w:right w:w="58" w:type="dxa"/>
+            </w:tcMar>
+          </w:tcPr>
+          <w:p>
+            <w:pPr>
+              <w:keepNext/>
+              <w:spacing w:after="40" w:before="40" w:line="240" w:lineRule="auto"/>
+              <w:ind w:firstLine="0" w:left="0" w:right="0"/>
+              <w:jc w:val="left"/>
+            </w:pPr>
+            <w:r>
+              <w:rPr>
+                <w:rFonts w:ascii="Times New Roman" w:hAnsi="Times New Roman"/>
+                <w:b w:val="0"/>
+                <w:sz w:val="16"/>
+              </w:rPr>
+              <w:t>50 / 0.1%</w:t>
+            </w:r>
+          </w:p>
+        </w:tc>
+        <w:tc>
+          <w:tcPr>
+            <w:tcW w:type="dxa" w:w="1086"/>
+            <w:vAlign w:val="center"/>
+            <w:tcMar>
+              <w:left w:w="58" w:type="dxa"/>
+              <w:right w:w="58" w:type="dxa"/>
+            </w:tcMar>
+          </w:tcPr>
+          <w:p>
+            <w:pPr>
+              <w:keepNext/>
+              <w:spacing w:after="40" w:before="40" w:line="240" w:lineRule="auto"/>
+              <w:ind w:firstLine="0" w:left="0" w:right="0"/>
+              <w:jc w:val="left"/>
+            </w:pPr>
+            <w:r>
+              <w:rPr>
+                <w:rFonts w:ascii="Times New Roman" w:hAnsi="Times New Roman"/>
+                <w:b w:val="0"/>
+                <w:sz w:val="16"/>
+              </w:rPr>
+              <w:t>Snapshot</w:t>
+            </w:r>
+          </w:p>
+        </w:tc>
+        <w:tc>
+          <w:tcPr>
+            <w:tcW w:type="dxa" w:w="782"/>
+            <w:vAlign w:val="center"/>
+            <w:tcMar>
+              <w:left w:w="58" w:type="dxa"/>
+              <w:right w:w="58" w:type="dxa"/>
+            </w:tcMar>
+          </w:tcPr>
+          <w:p>
+            <w:pPr>
+              <w:keepNext/>
+              <w:spacing w:after="40" w:before="40" w:line="240" w:lineRule="auto"/>
+              <w:ind w:firstLine="0" w:left="0" w:right="0"/>
+              <w:jc w:val="right"/>
+            </w:pPr>
+            <w:r>
+              <w:rPr>
+                <w:rFonts w:ascii="Times New Roman" w:hAnsi="Times New Roman"/>
+                <w:b w:val="0"/>
+                <w:sz w:val="16"/>
+              </w:rPr>
+              <w:t>219.28</w:t>
+            </w:r>
+          </w:p>
+        </w:tc>
+        <w:tc>
+          <w:tcPr>
+            <w:tcW w:type="dxa" w:w="695"/>
+            <w:vAlign w:val="center"/>
+            <w:tcMar>
+              <w:left w:w="58" w:type="dxa"/>
+              <w:right w:w="58" w:type="dxa"/>
+            </w:tcMar>
+          </w:tcPr>
+          <w:p>
+            <w:pPr>
+              <w:keepNext/>
+              <w:spacing w:after="40" w:before="40" w:line="240" w:lineRule="auto"/>
+              <w:ind w:firstLine="0" w:left="0" w:right="0"/>
+              <w:jc w:val="right"/>
+            </w:pPr>
+            <w:r>
+              <w:rPr>
+                <w:rFonts w:ascii="Times New Roman" w:hAnsi="Times New Roman"/>
+                <w:b w:val="0"/>
+                <w:sz w:val="16"/>
+              </w:rPr>
+              <w:t>1377.48</w:t>
+            </w:r>
+          </w:p>
+        </w:tc>
+        <w:tc>
+          <w:tcPr>
+            <w:tcW w:type="dxa" w:w="739"/>
+            <w:vAlign w:val="center"/>
+            <w:tcMar>
+              <w:left w:w="58" w:type="dxa"/>
+              <w:right w:w="58" w:type="dxa"/>
+            </w:tcMar>
+          </w:tcPr>
+          <w:p>
+            <w:pPr>
+              <w:keepNext/>
+              <w:spacing w:after="40" w:before="40" w:line="240" w:lineRule="auto"/>
+              <w:ind w:firstLine="0" w:left="0" w:right="0"/>
+              <w:jc w:val="right"/>
+            </w:pPr>
+            <w:r>
+              <w:rPr>
+                <w:rFonts w:ascii="Times New Roman" w:hAnsi="Times New Roman"/>
+                <w:b w:val="0"/>
+                <w:sz w:val="16"/>
+              </w:rPr>
+              <w:t>1645.60</w:t>
+            </w:r>
+          </w:p>
+        </w:tc>
+      </w:tr>
+      <w:tr>
+        <w:trPr>
+          <w:cantSplit/>
+        </w:trPr>
+        <w:tc>
+          <w:tcPr>
+            <w:tcW w:type="dxa" w:w="1043"/>
+            <w:vAlign w:val="center"/>
+            <w:tcMar>
+              <w:left w:w="58" w:type="dxa"/>
+              <w:right w:w="58" w:type="dxa"/>
+            </w:tcMar>
+          </w:tcPr>
+          <w:p>
+            <w:pPr>
+              <w:keepNext/>
+              <w:spacing w:after="40" w:before="40" w:line="240" w:lineRule="auto"/>
+              <w:ind w:firstLine="0" w:left="0" w:right="0"/>
+              <w:jc w:val="left"/>
+            </w:pPr>
+            <w:r>
+              <w:rPr>
+                <w:rFonts w:ascii="Times New Roman" w:hAnsi="Times New Roman"/>
+                <w:b w:val="0"/>
+                <w:sz w:val="16"/>
+              </w:rPr>
+              <w:t>50 / 0.1%</w:t>
+            </w:r>
+          </w:p>
+        </w:tc>
+        <w:tc>
+          <w:tcPr>
+            <w:tcW w:type="dxa" w:w="1086"/>
+            <w:vAlign w:val="center"/>
+            <w:tcMar>
+              <w:left w:w="58" w:type="dxa"/>
+              <w:right w:w="58" w:type="dxa"/>
+            </w:tcMar>
+          </w:tcPr>
+          <w:p>
+            <w:pPr>
+              <w:keepNext/>
+              <w:spacing w:after="40" w:before="40" w:line="240" w:lineRule="auto"/>
+              <w:ind w:firstLine="0" w:left="0" w:right="0"/>
+              <w:jc w:val="left"/>
+            </w:pPr>
+            <w:r>
+              <w:rPr>
+                <w:rFonts w:ascii="Times New Roman" w:hAnsi="Times New Roman"/>
+                <w:b w:val="0"/>
+                <w:sz w:val="16"/>
+              </w:rPr>
+              <w:t>Log-only</w:t>
+            </w:r>
+          </w:p>
+        </w:tc>
+        <w:tc>
+          <w:tcPr>
+            <w:tcW w:type="dxa" w:w="782"/>
+            <w:vAlign w:val="center"/>
+            <w:tcMar>
+              <w:left w:w="58" w:type="dxa"/>
+              <w:right w:w="58" w:type="dxa"/>
+            </w:tcMar>
+          </w:tcPr>
+          <w:p>
+            <w:pPr>
+              <w:keepNext/>
+              <w:spacing w:after="40" w:before="40" w:line="240" w:lineRule="auto"/>
+              <w:ind w:firstLine="0" w:left="0" w:right="0"/>
+              <w:jc w:val="right"/>
+            </w:pPr>
+            <w:r>
+              <w:rPr>
+                <w:rFonts w:ascii="Times New Roman" w:hAnsi="Times New Roman"/>
+                <w:b w:val="0"/>
+                <w:sz w:val="16"/>
+              </w:rPr>
+              <w:t>3.26</w:t>
+            </w:r>
+          </w:p>
+        </w:tc>
+        <w:tc>
+          <w:tcPr>
+            <w:tcW w:type="dxa" w:w="695"/>
+            <w:vAlign w:val="center"/>
+            <w:tcMar>
+              <w:left w:w="58" w:type="dxa"/>
+              <w:right w:w="58" w:type="dxa"/>
+            </w:tcMar>
+          </w:tcPr>
+          <w:p>
+            <w:pPr>
+              <w:keepNext/>
+              <w:spacing w:after="40" w:before="40" w:line="240" w:lineRule="auto"/>
+              <w:ind w:firstLine="0" w:left="0" w:right="0"/>
+              <w:jc w:val="right"/>
+            </w:pPr>
+            <w:r>
+              <w:rPr>
+                <w:rFonts w:ascii="Times New Roman" w:hAnsi="Times New Roman"/>
+                <w:b w:val="0"/>
+                <w:sz w:val="16"/>
+              </w:rPr>
+              <w:t>52.11</w:t>
+            </w:r>
+          </w:p>
+        </w:tc>
+        <w:tc>
+          <w:tcPr>
+            <w:tcW w:type="dxa" w:w="739"/>
+            <w:vAlign w:val="center"/>
+            <w:tcMar>
+              <w:left w:w="58" w:type="dxa"/>
+              <w:right w:w="58" w:type="dxa"/>
+            </w:tcMar>
+          </w:tcPr>
+          <w:p>
+            <w:pPr>
+              <w:keepNext/>
+              <w:spacing w:after="40" w:before="40" w:line="240" w:lineRule="auto"/>
+              <w:ind w:firstLine="0" w:left="0" w:right="0"/>
+              <w:jc w:val="right"/>
+            </w:pPr>
+            <w:r>
+              <w:rPr>
+                <w:rFonts w:ascii="Times New Roman" w:hAnsi="Times New Roman"/>
+                <w:b w:val="0"/>
+                <w:sz w:val="16"/>
+              </w:rPr>
+              <w:t>35.58</w:t>
+            </w:r>
+          </w:p>
+        </w:tc>
+      </w:tr>
+      <w:tr>
+        <w:trPr>
+          <w:cantSplit/>
+        </w:trPr>
+        <w:tc>
+          <w:tcPr>
+            <w:tcW w:type="dxa" w:w="1043"/>
+            <w:vAlign w:val="center"/>
+            <w:tcMar>
+              <w:left w:w="58" w:type="dxa"/>
+              <w:right w:w="58" w:type="dxa"/>
+            </w:tcMar>
+          </w:tcPr>
+          <w:p>
+            <w:pPr>
+              <w:keepNext/>
+              <w:spacing w:after="40" w:before="40" w:line="240" w:lineRule="auto"/>
+              <w:ind w:firstLine="0" w:left="0" w:right="0"/>
+              <w:jc w:val="left"/>
+            </w:pPr>
+            <w:r>
+              <w:rPr>
+                <w:rFonts w:ascii="Times New Roman" w:hAnsi="Times New Roman"/>
+                <w:b w:val="0"/>
+                <w:sz w:val="16"/>
+              </w:rPr>
+              <w:t>50 / 0.1%</w:t>
+            </w:r>
+          </w:p>
+        </w:tc>
+        <w:tc>
+          <w:tcPr>
+            <w:tcW w:type="dxa" w:w="1086"/>
+            <w:vAlign w:val="center"/>
+            <w:tcMar>
+              <w:left w:w="58" w:type="dxa"/>
+              <w:right w:w="58" w:type="dxa"/>
+            </w:tcMar>
+          </w:tcPr>
+          <w:p>
+            <w:pPr>
+              <w:keepNext/>
+              <w:spacing w:after="40" w:before="40" w:line="240" w:lineRule="auto"/>
+              <w:ind w:firstLine="0" w:left="0" w:right="0"/>
+              <w:jc w:val="left"/>
+            </w:pPr>
+            <w:r>
+              <w:rPr>
+                <w:rFonts w:ascii="Times New Roman" w:hAnsi="Times New Roman"/>
+                <w:b w:val="0"/>
+                <w:sz w:val="16"/>
+              </w:rPr>
+              <w:t>Revon-M</w:t>
+            </w:r>
+          </w:p>
+        </w:tc>
+        <w:tc>
+          <w:tcPr>
+            <w:tcW w:type="dxa" w:w="782"/>
+            <w:vAlign w:val="center"/>
+            <w:tcMar>
+              <w:left w:w="58" w:type="dxa"/>
+              <w:right w:w="58" w:type="dxa"/>
+            </w:tcMar>
+          </w:tcPr>
+          <w:p>
+            <w:pPr>
+              <w:keepNext/>
+              <w:spacing w:after="40" w:before="40" w:line="240" w:lineRule="auto"/>
+              <w:ind w:firstLine="0" w:left="0" w:right="0"/>
+              <w:jc w:val="right"/>
+            </w:pPr>
+            <w:r>
+              <w:rPr>
+                <w:rFonts w:ascii="Times New Roman" w:hAnsi="Times New Roman"/>
+                <w:b w:val="0"/>
+                <w:sz w:val="16"/>
+              </w:rPr>
+              <w:t>135.36</w:t>
+            </w:r>
+          </w:p>
+        </w:tc>
+        <w:tc>
+          <w:tcPr>
+            <w:tcW w:type="dxa" w:w="695"/>
+            <w:vAlign w:val="center"/>
+            <w:tcMar>
+              <w:left w:w="58" w:type="dxa"/>
+              <w:right w:w="58" w:type="dxa"/>
+            </w:tcMar>
+          </w:tcPr>
+          <w:p>
+            <w:pPr>
+              <w:keepNext/>
+              <w:spacing w:after="40" w:before="40" w:line="240" w:lineRule="auto"/>
+              <w:ind w:firstLine="0" w:left="0" w:right="0"/>
+              <w:jc w:val="right"/>
+            </w:pPr>
+            <w:r>
+              <w:rPr>
+                <w:rFonts w:ascii="Times New Roman" w:hAnsi="Times New Roman"/>
+                <w:b w:val="0"/>
+                <w:sz w:val="16"/>
+              </w:rPr>
+              <w:t>83.68</w:t>
+            </w:r>
+          </w:p>
+        </w:tc>
+        <w:tc>
+          <w:tcPr>
+            <w:tcW w:type="dxa" w:w="739"/>
+            <w:vAlign w:val="center"/>
+            <w:tcMar>
+              <w:left w:w="58" w:type="dxa"/>
+              <w:right w:w="58" w:type="dxa"/>
+            </w:tcMar>
+          </w:tcPr>
+          <w:p>
+            <w:pPr>
+              <w:keepNext/>
+              <w:spacing w:after="40" w:before="40" w:line="240" w:lineRule="auto"/>
+              <w:ind w:firstLine="0" w:left="0" w:right="0"/>
+              <w:jc w:val="right"/>
+            </w:pPr>
+            <w:r>
+              <w:rPr>
+                <w:rFonts w:ascii="Times New Roman" w:hAnsi="Times New Roman"/>
+                <w:b w:val="0"/>
+                <w:sz w:val="16"/>
+              </w:rPr>
+              <w:t>137.24</w:t>
+            </w:r>
+          </w:p>
+        </w:tc>
+      </w:tr>
+      <w:tr>
+        <w:trPr>
+          <w:cantSplit/>
+        </w:trPr>
+        <w:tc>
+          <w:tcPr>
+            <w:tcW w:type="dxa" w:w="1043"/>
+            <w:vAlign w:val="center"/>
+            <w:tcMar>
+              <w:left w:w="58" w:type="dxa"/>
+              <w:right w:w="58" w:type="dxa"/>
+            </w:tcMar>
+          </w:tcPr>
+          <w:p>
+            <w:pPr>
+              <w:keepNext/>
+              <w:spacing w:after="40" w:before="40" w:line="240" w:lineRule="auto"/>
+              <w:ind w:firstLine="0" w:left="0" w:right="0"/>
+              <w:jc w:val="left"/>
+            </w:pPr>
+            <w:r>
+              <w:rPr>
+                <w:rFonts w:ascii="Times New Roman" w:hAnsi="Times New Roman"/>
+                <w:b w:val="0"/>
+                <w:sz w:val="16"/>
+              </w:rPr>
+              <w:t>50 / 0.1%</w:t>
+            </w:r>
+          </w:p>
+        </w:tc>
+        <w:tc>
+          <w:tcPr>
+            <w:tcW w:type="dxa" w:w="1086"/>
+            <w:vAlign w:val="center"/>
+            <w:tcMar>
+              <w:left w:w="58" w:type="dxa"/>
+              <w:right w:w="58" w:type="dxa"/>
+            </w:tcMar>
+          </w:tcPr>
+          <w:p>
+            <w:pPr>
+              <w:keepNext/>
+              <w:spacing w:after="40" w:before="40" w:line="240" w:lineRule="auto"/>
+              <w:ind w:firstLine="0" w:left="0" w:right="0"/>
+              <w:jc w:val="left"/>
+            </w:pPr>
+            <w:r>
+              <w:rPr>
+                <w:rFonts w:ascii="Times New Roman" w:hAnsi="Times New Roman"/>
+                <w:b w:val="0"/>
+                <w:sz w:val="16"/>
+              </w:rPr>
+              <w:t>Revon-H</w:t>
+            </w:r>
+          </w:p>
+        </w:tc>
+        <w:tc>
+          <w:tcPr>
+            <w:tcW w:type="dxa" w:w="782"/>
+            <w:vAlign w:val="center"/>
+            <w:tcMar>
+              <w:left w:w="58" w:type="dxa"/>
+              <w:right w:w="58" w:type="dxa"/>
+            </w:tcMar>
+          </w:tcPr>
+          <w:p>
+            <w:pPr>
+              <w:keepNext/>
+              <w:spacing w:after="40" w:before="40" w:line="240" w:lineRule="auto"/>
+              <w:ind w:firstLine="0" w:left="0" w:right="0"/>
+              <w:jc w:val="right"/>
+            </w:pPr>
+            <w:r>
+              <w:rPr>
+                <w:rFonts w:ascii="Times New Roman" w:hAnsi="Times New Roman"/>
+                <w:b w:val="0"/>
+                <w:sz w:val="16"/>
+              </w:rPr>
+              <w:t>141.22</w:t>
+            </w:r>
+          </w:p>
+        </w:tc>
+        <w:tc>
+          <w:tcPr>
+            <w:tcW w:type="dxa" w:w="695"/>
+            <w:vAlign w:val="center"/>
+            <w:tcMar>
+              <w:left w:w="58" w:type="dxa"/>
+              <w:right w:w="58" w:type="dxa"/>
+            </w:tcMar>
+          </w:tcPr>
+          <w:p>
+            <w:pPr>
+              <w:keepNext/>
+              <w:spacing w:after="40" w:before="40" w:line="240" w:lineRule="auto"/>
+              <w:ind w:firstLine="0" w:left="0" w:right="0"/>
+              <w:jc w:val="right"/>
+            </w:pPr>
+            <w:r>
+              <w:rPr>
+                <w:rFonts w:ascii="Times New Roman" w:hAnsi="Times New Roman"/>
+                <w:b w:val="0"/>
+                <w:sz w:val="16"/>
+              </w:rPr>
+              <w:t>91.79</w:t>
+            </w:r>
+          </w:p>
+        </w:tc>
+        <w:tc>
+          <w:tcPr>
+            <w:tcW w:type="dxa" w:w="739"/>
+            <w:vAlign w:val="center"/>
+            <w:tcMar>
+              <w:left w:w="58" w:type="dxa"/>
+              <w:right w:w="58" w:type="dxa"/>
+            </w:tcMar>
+          </w:tcPr>
+          <w:p>
+            <w:pPr>
+              <w:keepNext/>
+              <w:spacing w:after="40" w:before="40" w:line="240" w:lineRule="auto"/>
+              <w:ind w:firstLine="0" w:left="0" w:right="0"/>
+              <w:jc w:val="right"/>
+            </w:pPr>
+            <w:r>
+              <w:rPr>
+                <w:rFonts w:ascii="Times New Roman" w:hAnsi="Times New Roman"/>
+                <w:b w:val="0"/>
+                <w:sz w:val="16"/>
+              </w:rPr>
+              <w:t>137.24</w:t>
+            </w:r>
+          </w:p>
+        </w:tc>
+      </w:tr>
+      <w:tr>
+        <w:trPr>
+          <w:cantSplit/>
+        </w:trPr>
+        <w:tc>
+          <w:tcPr>
+            <w:tcW w:type="dxa" w:w="1043"/>
+            <w:vAlign w:val="center"/>
+            <w:tcMar>
+              <w:left w:w="58" w:type="dxa"/>
+              <w:right w:w="58" w:type="dxa"/>
+            </w:tcMar>
+          </w:tcPr>
+          <w:p>
+            <w:pPr>
+              <w:keepNext/>
+              <w:spacing w:after="40" w:before="40" w:line="240" w:lineRule="auto"/>
+              <w:ind w:firstLine="0" w:left="0" w:right="0"/>
+              <w:jc w:val="left"/>
+            </w:pPr>
+            <w:r>
+              <w:rPr>
+                <w:rFonts w:ascii="Times New Roman" w:hAnsi="Times New Roman"/>
+                <w:b w:val="0"/>
+                <w:sz w:val="16"/>
+              </w:rPr>
+              <w:t>50 / 0.1%</w:t>
+            </w:r>
+          </w:p>
+        </w:tc>
+        <w:tc>
+          <w:tcPr>
+            <w:tcW w:type="dxa" w:w="1086"/>
+            <w:vAlign w:val="center"/>
+            <w:tcMar>
+              <w:left w:w="58" w:type="dxa"/>
+              <w:right w:w="58" w:type="dxa"/>
+            </w:tcMar>
+          </w:tcPr>
+          <w:p>
+            <w:pPr>
+              <w:keepNext/>
+              <w:spacing w:after="40" w:before="40" w:line="240" w:lineRule="auto"/>
+              <w:ind w:firstLine="0" w:left="0" w:right="0"/>
+              <w:jc w:val="left"/>
+            </w:pPr>
+            <w:r>
+              <w:rPr>
+                <w:rFonts w:ascii="Times New Roman" w:hAnsi="Times New Roman"/>
+                <w:b w:val="0"/>
+                <w:sz w:val="16"/>
+              </w:rPr>
+              <w:t>Dolt SQL</w:t>
+            </w:r>
+          </w:p>
+        </w:tc>
+        <w:tc>
+          <w:tcPr>
+            <w:tcW w:type="dxa" w:w="782"/>
+            <w:vAlign w:val="center"/>
+            <w:tcMar>
+              <w:left w:w="58" w:type="dxa"/>
+              <w:right w:w="58" w:type="dxa"/>
+            </w:tcMar>
+          </w:tcPr>
+          <w:p>
+            <w:pPr>
+              <w:keepNext/>
+              <w:spacing w:after="40" w:before="40" w:line="240" w:lineRule="auto"/>
+              <w:ind w:firstLine="0" w:left="0" w:right="0"/>
+              <w:jc w:val="right"/>
+            </w:pPr>
+            <w:r>
+              <w:rPr>
+                <w:rFonts w:ascii="Times New Roman" w:hAnsi="Times New Roman"/>
+                <w:b w:val="0"/>
+                <w:sz w:val="16"/>
+              </w:rPr>
+              <w:t>882.14</w:t>
+            </w:r>
+          </w:p>
+        </w:tc>
+        <w:tc>
+          <w:tcPr>
+            <w:tcW w:type="dxa" w:w="695"/>
+            <w:vAlign w:val="center"/>
+            <w:tcMar>
+              <w:left w:w="58" w:type="dxa"/>
+              <w:right w:w="58" w:type="dxa"/>
+            </w:tcMar>
+          </w:tcPr>
+          <w:p>
+            <w:pPr>
+              <w:keepNext/>
+              <w:spacing w:after="40" w:before="40" w:line="240" w:lineRule="auto"/>
+              <w:ind w:firstLine="0" w:left="0" w:right="0"/>
+              <w:jc w:val="right"/>
+            </w:pPr>
+            <w:r>
+              <w:rPr>
+                <w:rFonts w:ascii="Times New Roman" w:hAnsi="Times New Roman"/>
+                <w:b w:val="0"/>
+                <w:sz w:val="16"/>
+              </w:rPr>
+              <w:t>590.91</w:t>
+            </w:r>
+          </w:p>
+        </w:tc>
+        <w:tc>
+          <w:tcPr>
+            <w:tcW w:type="dxa" w:w="739"/>
+            <w:vAlign w:val="center"/>
+            <w:tcMar>
+              <w:left w:w="58" w:type="dxa"/>
+              <w:right w:w="58" w:type="dxa"/>
+            </w:tcMar>
+          </w:tcPr>
+          <w:p>
+            <w:pPr>
+              <w:keepNext/>
+              <w:spacing w:after="40" w:before="40" w:line="240" w:lineRule="auto"/>
+              <w:ind w:firstLine="0" w:left="0" w:right="0"/>
+              <w:jc w:val="right"/>
+            </w:pPr>
+            <w:r>
+              <w:rPr>
+                <w:rFonts w:ascii="Times New Roman" w:hAnsi="Times New Roman"/>
+                <w:b w:val="0"/>
+                <w:sz w:val="16"/>
+              </w:rPr>
+              <w:t>25.88</w:t>
+            </w:r>
+          </w:p>
+        </w:tc>
+      </w:tr>
+      <w:tr>
+        <w:trPr>
+          <w:cantSplit/>
+        </w:trPr>
+        <w:tc>
+          <w:tcPr>
+            <w:tcW w:type="dxa" w:w="1043"/>
+            <w:vAlign w:val="center"/>
+            <w:tcMar>
+              <w:left w:w="58" w:type="dxa"/>
+              <w:right w:w="58" w:type="dxa"/>
+            </w:tcMar>
+          </w:tcPr>
+          <w:p>
+            <w:pPr>
+              <w:keepNext/>
+              <w:spacing w:after="40" w:before="40" w:line="240" w:lineRule="auto"/>
+              <w:ind w:firstLine="0" w:left="0" w:right="0"/>
+              <w:jc w:val="left"/>
+            </w:pPr>
+            <w:r>
+              <w:rPr>
+                <w:rFonts w:ascii="Times New Roman" w:hAnsi="Times New Roman"/>
+                <w:b w:val="0"/>
+                <w:sz w:val="16"/>
+              </w:rPr>
+              <w:t>50 / 0.1%</w:t>
+            </w:r>
+          </w:p>
+        </w:tc>
+        <w:tc>
+          <w:tcPr>
+            <w:tcW w:type="dxa" w:w="1086"/>
+            <w:vAlign w:val="center"/>
+            <w:tcMar>
+              <w:left w:w="58" w:type="dxa"/>
+              <w:right w:w="58" w:type="dxa"/>
+            </w:tcMar>
+          </w:tcPr>
+          <w:p>
+            <w:pPr>
+              <w:keepNext/>
+              <w:spacing w:after="40" w:before="40" w:line="240" w:lineRule="auto"/>
+              <w:ind w:firstLine="0" w:left="0" w:right="0"/>
+              <w:jc w:val="left"/>
+            </w:pPr>
+            <w:r>
+              <w:rPr>
+                <w:rFonts w:ascii="Times New Roman" w:hAnsi="Times New Roman"/>
+                <w:b w:val="0"/>
+                <w:sz w:val="16"/>
+              </w:rPr>
+              <w:t>Dolt CSV</w:t>
+            </w:r>
+          </w:p>
+        </w:tc>
+        <w:tc>
+          <w:tcPr>
+            <w:tcW w:type="dxa" w:w="782"/>
+            <w:vAlign w:val="center"/>
+            <w:tcMar>
+              <w:left w:w="58" w:type="dxa"/>
+              <w:right w:w="58" w:type="dxa"/>
+            </w:tcMar>
+          </w:tcPr>
+          <w:p>
+            <w:pPr>
+              <w:keepNext/>
+              <w:spacing w:after="40" w:before="40" w:line="240" w:lineRule="auto"/>
+              <w:ind w:firstLine="0" w:left="0" w:right="0"/>
+              <w:jc w:val="right"/>
+            </w:pPr>
+            <w:r>
+              <w:rPr>
+                <w:rFonts w:ascii="Times New Roman" w:hAnsi="Times New Roman"/>
+                <w:b w:val="0"/>
+                <w:sz w:val="16"/>
+              </w:rPr>
+              <w:t>873.70</w:t>
+            </w:r>
+          </w:p>
+        </w:tc>
+        <w:tc>
+          <w:tcPr>
+            <w:tcW w:type="dxa" w:w="695"/>
+            <w:vAlign w:val="center"/>
+            <w:tcMar>
+              <w:left w:w="58" w:type="dxa"/>
+              <w:right w:w="58" w:type="dxa"/>
+            </w:tcMar>
+          </w:tcPr>
+          <w:p>
+            <w:pPr>
+              <w:keepNext/>
+              <w:spacing w:after="40" w:before="40" w:line="240" w:lineRule="auto"/>
+              <w:ind w:firstLine="0" w:left="0" w:right="0"/>
+              <w:jc w:val="right"/>
+            </w:pPr>
+            <w:r>
+              <w:rPr>
+                <w:rFonts w:ascii="Times New Roman" w:hAnsi="Times New Roman"/>
+                <w:b w:val="0"/>
+                <w:sz w:val="16"/>
+              </w:rPr>
+              <w:t>525.45</w:t>
+            </w:r>
+          </w:p>
+        </w:tc>
+        <w:tc>
+          <w:tcPr>
+            <w:tcW w:type="dxa" w:w="739"/>
+            <w:vAlign w:val="center"/>
+            <w:tcMar>
+              <w:left w:w="58" w:type="dxa"/>
+              <w:right w:w="58" w:type="dxa"/>
+            </w:tcMar>
+          </w:tcPr>
+          <w:p>
+            <w:pPr>
+              <w:keepNext/>
+              <w:spacing w:after="40" w:before="40" w:line="240" w:lineRule="auto"/>
+              <w:ind w:firstLine="0" w:left="0" w:right="0"/>
+              <w:jc w:val="right"/>
+            </w:pPr>
+            <w:r>
+              <w:rPr>
+                <w:rFonts w:ascii="Times New Roman" w:hAnsi="Times New Roman"/>
+                <w:b w:val="0"/>
+                <w:sz w:val="16"/>
+              </w:rPr>
+              <w:t>25.33</w:t>
+            </w:r>
+          </w:p>
+        </w:tc>
+      </w:tr>
+      <w:tr>
+        <w:trPr>
+          <w:cantSplit/>
+        </w:trPr>
+        <w:tc>
+          <w:tcPr>
+            <w:tcW w:type="dxa" w:w="1043"/>
+            <w:vAlign w:val="center"/>
+            <w:tcMar>
+              <w:left w:w="58" w:type="dxa"/>
+              <w:right w:w="58" w:type="dxa"/>
+            </w:tcMar>
+          </w:tcPr>
+          <w:p>
+            <w:pPr>
+              <w:keepNext/>
+              <w:spacing w:after="40" w:before="40" w:line="240" w:lineRule="auto"/>
+              <w:ind w:firstLine="0" w:left="0" w:right="0"/>
+              <w:jc w:val="left"/>
+            </w:pPr>
+            <w:r>
+              <w:rPr>
+                <w:rFonts w:ascii="Times New Roman" w:hAnsi="Times New Roman"/>
+                <w:b w:val="0"/>
+                <w:sz w:val="16"/>
+              </w:rPr>
+              <w:t>10 / 0.01%</w:t>
+            </w:r>
+          </w:p>
+        </w:tc>
+        <w:tc>
+          <w:tcPr>
+            <w:tcW w:type="dxa" w:w="1086"/>
+            <w:vAlign w:val="center"/>
+            <w:tcMar>
+              <w:left w:w="58" w:type="dxa"/>
+              <w:right w:w="58" w:type="dxa"/>
+            </w:tcMar>
+          </w:tcPr>
+          <w:p>
+            <w:pPr>
+              <w:keepNext/>
+              <w:spacing w:after="40" w:before="40" w:line="240" w:lineRule="auto"/>
+              <w:ind w:firstLine="0" w:left="0" w:right="0"/>
+              <w:jc w:val="left"/>
+            </w:pPr>
+            <w:r>
+              <w:rPr>
+                <w:rFonts w:ascii="Times New Roman" w:hAnsi="Times New Roman"/>
+                <w:b w:val="0"/>
+                <w:sz w:val="16"/>
+              </w:rPr>
+              <w:t>Snapshot</w:t>
+            </w:r>
+          </w:p>
+        </w:tc>
+        <w:tc>
+          <w:tcPr>
+            <w:tcW w:type="dxa" w:w="782"/>
+            <w:vAlign w:val="center"/>
+            <w:tcMar>
+              <w:left w:w="58" w:type="dxa"/>
+              <w:right w:w="58" w:type="dxa"/>
+            </w:tcMar>
+          </w:tcPr>
+          <w:p>
+            <w:pPr>
+              <w:keepNext/>
+              <w:spacing w:after="40" w:before="40" w:line="240" w:lineRule="auto"/>
+              <w:ind w:firstLine="0" w:left="0" w:right="0"/>
+              <w:jc w:val="right"/>
+            </w:pPr>
+            <w:r>
+              <w:rPr>
+                <w:rFonts w:ascii="Times New Roman" w:hAnsi="Times New Roman"/>
+                <w:b w:val="0"/>
+                <w:sz w:val="16"/>
+              </w:rPr>
+              <w:t>236.94</w:t>
+            </w:r>
+          </w:p>
+        </w:tc>
+        <w:tc>
+          <w:tcPr>
+            <w:tcW w:type="dxa" w:w="695"/>
+            <w:vAlign w:val="center"/>
+            <w:tcMar>
+              <w:left w:w="58" w:type="dxa"/>
+              <w:right w:w="58" w:type="dxa"/>
+            </w:tcMar>
+          </w:tcPr>
+          <w:p>
+            <w:pPr>
+              <w:keepNext/>
+              <w:spacing w:after="40" w:before="40" w:line="240" w:lineRule="auto"/>
+              <w:ind w:firstLine="0" w:left="0" w:right="0"/>
+              <w:jc w:val="right"/>
+            </w:pPr>
+            <w:r>
+              <w:rPr>
+                <w:rFonts w:ascii="Times New Roman" w:hAnsi="Times New Roman"/>
+                <w:b w:val="0"/>
+                <w:sz w:val="16"/>
+              </w:rPr>
+              <w:t>1257.26</w:t>
+            </w:r>
+          </w:p>
+        </w:tc>
+        <w:tc>
+          <w:tcPr>
+            <w:tcW w:type="dxa" w:w="739"/>
+            <w:vAlign w:val="center"/>
+            <w:tcMar>
+              <w:left w:w="58" w:type="dxa"/>
+              <w:right w:w="58" w:type="dxa"/>
+            </w:tcMar>
+          </w:tcPr>
+          <w:p>
+            <w:pPr>
+              <w:keepNext/>
+              <w:spacing w:after="40" w:before="40" w:line="240" w:lineRule="auto"/>
+              <w:ind w:firstLine="0" w:left="0" w:right="0"/>
+              <w:jc w:val="right"/>
+            </w:pPr>
+            <w:r>
+              <w:rPr>
+                <w:rFonts w:ascii="Times New Roman" w:hAnsi="Times New Roman"/>
+                <w:b w:val="0"/>
+                <w:sz w:val="16"/>
+              </w:rPr>
+              <w:t>354.90</w:t>
+            </w:r>
+          </w:p>
+        </w:tc>
+      </w:tr>
+      <w:tr>
+        <w:trPr>
+          <w:cantSplit/>
+        </w:trPr>
+        <w:tc>
+          <w:tcPr>
+            <w:tcW w:type="dxa" w:w="1043"/>
+            <w:vAlign w:val="center"/>
+            <w:tcMar>
+              <w:left w:w="58" w:type="dxa"/>
+              <w:right w:w="58" w:type="dxa"/>
+            </w:tcMar>
+          </w:tcPr>
+          <w:p>
+            <w:pPr>
+              <w:keepNext/>
+              <w:spacing w:after="40" w:before="40" w:line="240" w:lineRule="auto"/>
+              <w:ind w:firstLine="0" w:left="0" w:right="0"/>
+              <w:jc w:val="left"/>
+            </w:pPr>
+            <w:r>
+              <w:rPr>
+                <w:rFonts w:ascii="Times New Roman" w:hAnsi="Times New Roman"/>
+                <w:b w:val="0"/>
+                <w:sz w:val="16"/>
+              </w:rPr>
+              <w:t>10 / 0.01%</w:t>
+            </w:r>
+          </w:p>
+        </w:tc>
+        <w:tc>
+          <w:tcPr>
+            <w:tcW w:type="dxa" w:w="1086"/>
+            <w:vAlign w:val="center"/>
+            <w:tcMar>
+              <w:left w:w="58" w:type="dxa"/>
+              <w:right w:w="58" w:type="dxa"/>
+            </w:tcMar>
+          </w:tcPr>
+          <w:p>
+            <w:pPr>
+              <w:keepNext/>
+              <w:spacing w:after="40" w:before="40" w:line="240" w:lineRule="auto"/>
+              <w:ind w:firstLine="0" w:left="0" w:right="0"/>
+              <w:jc w:val="left"/>
+            </w:pPr>
+            <w:r>
+              <w:rPr>
+                <w:rFonts w:ascii="Times New Roman" w:hAnsi="Times New Roman"/>
+                <w:b w:val="0"/>
+                <w:sz w:val="16"/>
+              </w:rPr>
+              <w:t>Log-only</w:t>
+            </w:r>
+          </w:p>
+        </w:tc>
+        <w:tc>
+          <w:tcPr>
+            <w:tcW w:type="dxa" w:w="782"/>
+            <w:vAlign w:val="center"/>
+            <w:tcMar>
+              <w:left w:w="58" w:type="dxa"/>
+              <w:right w:w="58" w:type="dxa"/>
+            </w:tcMar>
+          </w:tcPr>
+          <w:p>
+            <w:pPr>
+              <w:keepNext/>
+              <w:spacing w:after="40" w:before="40" w:line="240" w:lineRule="auto"/>
+              <w:ind w:firstLine="0" w:left="0" w:right="0"/>
+              <w:jc w:val="right"/>
+            </w:pPr>
+            <w:r>
+              <w:rPr>
+                <w:rFonts w:ascii="Times New Roman" w:hAnsi="Times New Roman"/>
+                <w:b w:val="0"/>
+                <w:sz w:val="16"/>
+              </w:rPr>
+              <w:t>3.00</w:t>
+            </w:r>
+          </w:p>
+        </w:tc>
+        <w:tc>
+          <w:tcPr>
+            <w:tcW w:type="dxa" w:w="695"/>
+            <w:vAlign w:val="center"/>
+            <w:tcMar>
+              <w:left w:w="58" w:type="dxa"/>
+              <w:right w:w="58" w:type="dxa"/>
+            </w:tcMar>
+          </w:tcPr>
+          <w:p>
+            <w:pPr>
+              <w:keepNext/>
+              <w:spacing w:after="40" w:before="40" w:line="240" w:lineRule="auto"/>
+              <w:ind w:firstLine="0" w:left="0" w:right="0"/>
+              <w:jc w:val="right"/>
+            </w:pPr>
+            <w:r>
+              <w:rPr>
+                <w:rFonts w:ascii="Times New Roman" w:hAnsi="Times New Roman"/>
+                <w:b w:val="0"/>
+                <w:sz w:val="16"/>
+              </w:rPr>
+              <w:t>21.38</w:t>
+            </w:r>
+          </w:p>
+        </w:tc>
+        <w:tc>
+          <w:tcPr>
+            <w:tcW w:type="dxa" w:w="739"/>
+            <w:vAlign w:val="center"/>
+            <w:tcMar>
+              <w:left w:w="58" w:type="dxa"/>
+              <w:right w:w="58" w:type="dxa"/>
+            </w:tcMar>
+          </w:tcPr>
+          <w:p>
+            <w:pPr>
+              <w:keepNext/>
+              <w:spacing w:after="40" w:before="40" w:line="240" w:lineRule="auto"/>
+              <w:ind w:firstLine="0" w:left="0" w:right="0"/>
+              <w:jc w:val="right"/>
+            </w:pPr>
+            <w:r>
+              <w:rPr>
+                <w:rFonts w:ascii="Times New Roman" w:hAnsi="Times New Roman"/>
+                <w:b w:val="0"/>
+                <w:sz w:val="16"/>
+              </w:rPr>
+              <w:t>32.33</w:t>
+            </w:r>
+          </w:p>
+        </w:tc>
+      </w:tr>
+      <w:tr>
+        <w:trPr>
+          <w:cantSplit/>
+        </w:trPr>
+        <w:tc>
+          <w:tcPr>
+            <w:tcW w:type="dxa" w:w="1043"/>
+            <w:vAlign w:val="center"/>
+            <w:tcMar>
+              <w:left w:w="58" w:type="dxa"/>
+              <w:right w:w="58" w:type="dxa"/>
+            </w:tcMar>
+          </w:tcPr>
+          <w:p>
+            <w:pPr>
+              <w:keepNext/>
+              <w:spacing w:after="40" w:before="40" w:line="240" w:lineRule="auto"/>
+              <w:ind w:firstLine="0" w:left="0" w:right="0"/>
+              <w:jc w:val="left"/>
+            </w:pPr>
+            <w:r>
+              <w:rPr>
+                <w:rFonts w:ascii="Times New Roman" w:hAnsi="Times New Roman"/>
+                <w:b w:val="0"/>
+                <w:sz w:val="16"/>
+              </w:rPr>
+              <w:t>10 / 0.01%</w:t>
+            </w:r>
+          </w:p>
+        </w:tc>
+        <w:tc>
+          <w:tcPr>
+            <w:tcW w:type="dxa" w:w="1086"/>
+            <w:vAlign w:val="center"/>
+            <w:tcMar>
+              <w:left w:w="58" w:type="dxa"/>
+              <w:right w:w="58" w:type="dxa"/>
+            </w:tcMar>
+          </w:tcPr>
+          <w:p>
+            <w:pPr>
+              <w:keepNext/>
+              <w:spacing w:after="40" w:before="40" w:line="240" w:lineRule="auto"/>
+              <w:ind w:firstLine="0" w:left="0" w:right="0"/>
+              <w:jc w:val="left"/>
+            </w:pPr>
+            <w:r>
+              <w:rPr>
+                <w:rFonts w:ascii="Times New Roman" w:hAnsi="Times New Roman"/>
+                <w:b w:val="0"/>
+                <w:sz w:val="16"/>
+              </w:rPr>
+              <w:t>Revon-M</w:t>
+            </w:r>
+          </w:p>
+        </w:tc>
+        <w:tc>
+          <w:tcPr>
+            <w:tcW w:type="dxa" w:w="782"/>
+            <w:vAlign w:val="center"/>
+            <w:tcMar>
+              <w:left w:w="58" w:type="dxa"/>
+              <w:right w:w="58" w:type="dxa"/>
+            </w:tcMar>
+          </w:tcPr>
+          <w:p>
+            <w:pPr>
+              <w:keepNext/>
+              <w:spacing w:after="40" w:before="40" w:line="240" w:lineRule="auto"/>
+              <w:ind w:firstLine="0" w:left="0" w:right="0"/>
+              <w:jc w:val="right"/>
+            </w:pPr>
+            <w:r>
+              <w:rPr>
+                <w:rFonts w:ascii="Times New Roman" w:hAnsi="Times New Roman"/>
+                <w:b w:val="0"/>
+                <w:sz w:val="16"/>
+              </w:rPr>
+              <w:t>26.57</w:t>
+            </w:r>
+          </w:p>
+        </w:tc>
+        <w:tc>
+          <w:tcPr>
+            <w:tcW w:type="dxa" w:w="695"/>
+            <w:vAlign w:val="center"/>
+            <w:tcMar>
+              <w:left w:w="58" w:type="dxa"/>
+              <w:right w:w="58" w:type="dxa"/>
+            </w:tcMar>
+          </w:tcPr>
+          <w:p>
+            <w:pPr>
+              <w:keepNext/>
+              <w:spacing w:after="40" w:before="40" w:line="240" w:lineRule="auto"/>
+              <w:ind w:firstLine="0" w:left="0" w:right="0"/>
+              <w:jc w:val="right"/>
+            </w:pPr>
+            <w:r>
+              <w:rPr>
+                <w:rFonts w:ascii="Times New Roman" w:hAnsi="Times New Roman"/>
+                <w:b w:val="0"/>
+                <w:sz w:val="16"/>
+              </w:rPr>
+              <w:t>2.78</w:t>
+            </w:r>
+          </w:p>
+        </w:tc>
+        <w:tc>
+          <w:tcPr>
+            <w:tcW w:type="dxa" w:w="739"/>
+            <w:vAlign w:val="center"/>
+            <w:tcMar>
+              <w:left w:w="58" w:type="dxa"/>
+              <w:right w:w="58" w:type="dxa"/>
+            </w:tcMar>
+          </w:tcPr>
+          <w:p>
+            <w:pPr>
+              <w:keepNext/>
+              <w:spacing w:after="40" w:before="40" w:line="240" w:lineRule="auto"/>
+              <w:ind w:firstLine="0" w:left="0" w:right="0"/>
+              <w:jc w:val="right"/>
+            </w:pPr>
+            <w:r>
+              <w:rPr>
+                <w:rFonts w:ascii="Times New Roman" w:hAnsi="Times New Roman"/>
+                <w:b w:val="0"/>
+                <w:sz w:val="16"/>
+              </w:rPr>
+              <w:t>79.68</w:t>
+            </w:r>
+          </w:p>
+        </w:tc>
+      </w:tr>
+      <w:tr>
+        <w:trPr>
+          <w:cantSplit/>
+        </w:trPr>
+        <w:tc>
+          <w:tcPr>
+            <w:tcW w:type="dxa" w:w="1043"/>
+            <w:vAlign w:val="center"/>
+            <w:tcMar>
+              <w:left w:w="58" w:type="dxa"/>
+              <w:right w:w="58" w:type="dxa"/>
+            </w:tcMar>
+          </w:tcPr>
+          <w:p>
+            <w:pPr>
+              <w:keepNext/>
+              <w:spacing w:after="40" w:before="40" w:line="240" w:lineRule="auto"/>
+              <w:ind w:firstLine="0" w:left="0" w:right="0"/>
+              <w:jc w:val="left"/>
+            </w:pPr>
+            <w:r>
+              <w:rPr>
+                <w:rFonts w:ascii="Times New Roman" w:hAnsi="Times New Roman"/>
+                <w:b w:val="0"/>
+                <w:sz w:val="16"/>
+              </w:rPr>
+              <w:t>10 / 0.01%</w:t>
+            </w:r>
+          </w:p>
+        </w:tc>
+        <w:tc>
+          <w:tcPr>
+            <w:tcW w:type="dxa" w:w="1086"/>
+            <w:vAlign w:val="center"/>
+            <w:tcMar>
+              <w:left w:w="58" w:type="dxa"/>
+              <w:right w:w="58" w:type="dxa"/>
+            </w:tcMar>
+          </w:tcPr>
+          <w:p>
+            <w:pPr>
+              <w:keepNext/>
+              <w:spacing w:after="40" w:before="40" w:line="240" w:lineRule="auto"/>
+              <w:ind w:firstLine="0" w:left="0" w:right="0"/>
+              <w:jc w:val="left"/>
+            </w:pPr>
+            <w:r>
+              <w:rPr>
+                <w:rFonts w:ascii="Times New Roman" w:hAnsi="Times New Roman"/>
+                <w:b w:val="0"/>
+                <w:sz w:val="16"/>
+              </w:rPr>
+              <w:t>Revon-H</w:t>
+            </w:r>
+          </w:p>
+        </w:tc>
+        <w:tc>
+          <w:tcPr>
+            <w:tcW w:type="dxa" w:w="782"/>
+            <w:vAlign w:val="center"/>
+            <w:tcMar>
+              <w:left w:w="58" w:type="dxa"/>
+              <w:right w:w="58" w:type="dxa"/>
+            </w:tcMar>
+          </w:tcPr>
+          <w:p>
+            <w:pPr>
+              <w:keepNext/>
+              <w:spacing w:after="40" w:before="40" w:line="240" w:lineRule="auto"/>
+              <w:ind w:firstLine="0" w:left="0" w:right="0"/>
+              <w:jc w:val="right"/>
+            </w:pPr>
+            <w:r>
+              <w:rPr>
+                <w:rFonts w:ascii="Times New Roman" w:hAnsi="Times New Roman"/>
+                <w:b w:val="0"/>
+                <w:sz w:val="16"/>
+              </w:rPr>
+              <w:t>28.56</w:t>
+            </w:r>
+          </w:p>
+        </w:tc>
+        <w:tc>
+          <w:tcPr>
+            <w:tcW w:type="dxa" w:w="695"/>
+            <w:vAlign w:val="center"/>
+            <w:tcMar>
+              <w:left w:w="58" w:type="dxa"/>
+              <w:right w:w="58" w:type="dxa"/>
+            </w:tcMar>
+          </w:tcPr>
+          <w:p>
+            <w:pPr>
+              <w:keepNext/>
+              <w:spacing w:after="40" w:before="40" w:line="240" w:lineRule="auto"/>
+              <w:ind w:firstLine="0" w:left="0" w:right="0"/>
+              <w:jc w:val="right"/>
+            </w:pPr>
+            <w:r>
+              <w:rPr>
+                <w:rFonts w:ascii="Times New Roman" w:hAnsi="Times New Roman"/>
+                <w:b w:val="0"/>
+                <w:sz w:val="16"/>
+              </w:rPr>
+              <w:t>0.78</w:t>
+            </w:r>
+          </w:p>
+        </w:tc>
+        <w:tc>
+          <w:tcPr>
+            <w:tcW w:type="dxa" w:w="739"/>
+            <w:vAlign w:val="center"/>
+            <w:tcMar>
+              <w:left w:w="58" w:type="dxa"/>
+              <w:right w:w="58" w:type="dxa"/>
+            </w:tcMar>
+          </w:tcPr>
+          <w:p>
+            <w:pPr>
+              <w:keepNext/>
+              <w:spacing w:after="40" w:before="40" w:line="240" w:lineRule="auto"/>
+              <w:ind w:firstLine="0" w:left="0" w:right="0"/>
+              <w:jc w:val="right"/>
+            </w:pPr>
+            <w:r>
+              <w:rPr>
+                <w:rFonts w:ascii="Times New Roman" w:hAnsi="Times New Roman"/>
+                <w:b w:val="0"/>
+                <w:sz w:val="16"/>
+              </w:rPr>
+              <w:t>79.68</w:t>
+            </w:r>
+          </w:p>
+        </w:tc>
+      </w:tr>
+      <w:tr>
+        <w:trPr>
+          <w:cantSplit/>
+        </w:trPr>
+        <w:tc>
+          <w:tcPr>
+            <w:tcW w:type="dxa" w:w="1043"/>
+            <w:vAlign w:val="center"/>
+            <w:tcMar>
+              <w:left w:w="58" w:type="dxa"/>
+              <w:right w:w="58" w:type="dxa"/>
+            </w:tcMar>
+          </w:tcPr>
+          <w:p>
+            <w:pPr>
+              <w:keepNext/>
+              <w:spacing w:after="40" w:before="40" w:line="240" w:lineRule="auto"/>
+              <w:ind w:firstLine="0" w:left="0" w:right="0"/>
+              <w:jc w:val="left"/>
+            </w:pPr>
+            <w:r>
+              <w:rPr>
+                <w:rFonts w:ascii="Times New Roman" w:hAnsi="Times New Roman"/>
+                <w:b w:val="0"/>
+                <w:sz w:val="16"/>
+              </w:rPr>
+              <w:t>10 / 0.01%</w:t>
+            </w:r>
+          </w:p>
+        </w:tc>
+        <w:tc>
+          <w:tcPr>
+            <w:tcW w:type="dxa" w:w="1086"/>
+            <w:vAlign w:val="center"/>
+            <w:tcMar>
+              <w:left w:w="58" w:type="dxa"/>
+              <w:right w:w="58" w:type="dxa"/>
+            </w:tcMar>
+          </w:tcPr>
+          <w:p>
+            <w:pPr>
+              <w:keepNext/>
+              <w:spacing w:after="40" w:before="40" w:line="240" w:lineRule="auto"/>
+              <w:ind w:firstLine="0" w:left="0" w:right="0"/>
+              <w:jc w:val="left"/>
+            </w:pPr>
+            <w:r>
+              <w:rPr>
+                <w:rFonts w:ascii="Times New Roman" w:hAnsi="Times New Roman"/>
+                <w:b w:val="0"/>
+                <w:sz w:val="16"/>
+              </w:rPr>
+              <w:t>Dolt SQL</w:t>
+            </w:r>
+          </w:p>
+        </w:tc>
+        <w:tc>
+          <w:tcPr>
+            <w:tcW w:type="dxa" w:w="782"/>
+            <w:vAlign w:val="center"/>
+            <w:tcMar>
+              <w:left w:w="58" w:type="dxa"/>
+              <w:right w:w="58" w:type="dxa"/>
+            </w:tcMar>
+          </w:tcPr>
+          <w:p>
+            <w:pPr>
+              <w:keepNext/>
+              <w:spacing w:after="40" w:before="40" w:line="240" w:lineRule="auto"/>
+              <w:ind w:firstLine="0" w:left="0" w:right="0"/>
+              <w:jc w:val="right"/>
+            </w:pPr>
+            <w:r>
+              <w:rPr>
+                <w:rFonts w:ascii="Times New Roman" w:hAnsi="Times New Roman"/>
+                <w:b w:val="0"/>
+                <w:sz w:val="16"/>
+              </w:rPr>
+              <w:t>1001.47</w:t>
+            </w:r>
+          </w:p>
+        </w:tc>
+        <w:tc>
+          <w:tcPr>
+            <w:tcW w:type="dxa" w:w="695"/>
+            <w:vAlign w:val="center"/>
+            <w:tcMar>
+              <w:left w:w="58" w:type="dxa"/>
+              <w:right w:w="58" w:type="dxa"/>
+            </w:tcMar>
+          </w:tcPr>
+          <w:p>
+            <w:pPr>
+              <w:keepNext/>
+              <w:spacing w:after="40" w:before="40" w:line="240" w:lineRule="auto"/>
+              <w:ind w:firstLine="0" w:left="0" w:right="0"/>
+              <w:jc w:val="right"/>
+            </w:pPr>
+            <w:r>
+              <w:rPr>
+                <w:rFonts w:ascii="Times New Roman" w:hAnsi="Times New Roman"/>
+                <w:b w:val="0"/>
+                <w:sz w:val="16"/>
+              </w:rPr>
+              <w:t>374.25</w:t>
+            </w:r>
+          </w:p>
+        </w:tc>
+        <w:tc>
+          <w:tcPr>
+            <w:tcW w:type="dxa" w:w="739"/>
+            <w:vAlign w:val="center"/>
+            <w:tcMar>
+              <w:left w:w="58" w:type="dxa"/>
+              <w:right w:w="58" w:type="dxa"/>
+            </w:tcMar>
+          </w:tcPr>
+          <w:p>
+            <w:pPr>
+              <w:keepNext/>
+              <w:spacing w:after="40" w:before="40" w:line="240" w:lineRule="auto"/>
+              <w:ind w:firstLine="0" w:left="0" w:right="0"/>
+              <w:jc w:val="right"/>
+            </w:pPr>
+            <w:r>
+              <w:rPr>
+                <w:rFonts w:ascii="Times New Roman" w:hAnsi="Times New Roman"/>
+                <w:b w:val="0"/>
+                <w:sz w:val="16"/>
+              </w:rPr>
+              <w:t>10.85</w:t>
+            </w:r>
+          </w:p>
+        </w:tc>
+      </w:tr>
+      <w:tr>
+        <w:trPr>
+          <w:cantSplit/>
+        </w:trPr>
+        <w:tc>
+          <w:tcPr>
+            <w:tcW w:type="dxa" w:w="1043"/>
+            <w:vAlign w:val="center"/>
+            <w:tcMar>
+              <w:left w:w="58" w:type="dxa"/>
+              <w:right w:w="58" w:type="dxa"/>
+            </w:tcMar>
+          </w:tcPr>
+          <w:p>
+            <w:pPr>
+              <w:keepNext/>
+              <w:spacing w:after="40" w:before="40" w:line="240" w:lineRule="auto"/>
+              <w:ind w:firstLine="0" w:left="0" w:right="0"/>
+              <w:jc w:val="left"/>
+            </w:pPr>
+            <w:r>
+              <w:rPr>
+                <w:rFonts w:ascii="Times New Roman" w:hAnsi="Times New Roman"/>
+                <w:b w:val="0"/>
+                <w:sz w:val="16"/>
+              </w:rPr>
+              <w:t>10 / 0.01%</w:t>
+            </w:r>
+          </w:p>
+        </w:tc>
+        <w:tc>
+          <w:tcPr>
+            <w:tcW w:type="dxa" w:w="1086"/>
+            <w:vAlign w:val="center"/>
+            <w:tcMar>
+              <w:left w:w="58" w:type="dxa"/>
+              <w:right w:w="58" w:type="dxa"/>
+            </w:tcMar>
+          </w:tcPr>
+          <w:p>
+            <w:pPr>
+              <w:keepNext/>
+              <w:spacing w:after="40" w:before="40" w:line="240" w:lineRule="auto"/>
+              <w:ind w:firstLine="0" w:left="0" w:right="0"/>
+              <w:jc w:val="left"/>
+            </w:pPr>
+            <w:r>
+              <w:rPr>
+                <w:rFonts w:ascii="Times New Roman" w:hAnsi="Times New Roman"/>
+                <w:b w:val="0"/>
+                <w:sz w:val="16"/>
+              </w:rPr>
+              <w:t>Dolt CSV</w:t>
+            </w:r>
+          </w:p>
+        </w:tc>
+        <w:tc>
+          <w:tcPr>
+            <w:tcW w:type="dxa" w:w="782"/>
+            <w:vAlign w:val="center"/>
+            <w:tcMar>
+              <w:left w:w="58" w:type="dxa"/>
+              <w:right w:w="58" w:type="dxa"/>
+            </w:tcMar>
+          </w:tcPr>
+          <w:p>
+            <w:pPr>
+              <w:keepNext/>
+              <w:spacing w:after="40" w:before="40" w:line="240" w:lineRule="auto"/>
+              <w:ind w:firstLine="0" w:left="0" w:right="0"/>
+              <w:jc w:val="right"/>
+            </w:pPr>
+            <w:r>
+              <w:rPr>
+                <w:rFonts w:ascii="Times New Roman" w:hAnsi="Times New Roman"/>
+                <w:b w:val="0"/>
+                <w:sz w:val="16"/>
+              </w:rPr>
+              <w:t>1015.52</w:t>
+            </w:r>
+          </w:p>
+        </w:tc>
+        <w:tc>
+          <w:tcPr>
+            <w:tcW w:type="dxa" w:w="695"/>
+            <w:vAlign w:val="center"/>
+            <w:tcMar>
+              <w:left w:w="58" w:type="dxa"/>
+              <w:right w:w="58" w:type="dxa"/>
+            </w:tcMar>
+          </w:tcPr>
+          <w:p>
+            <w:pPr>
+              <w:keepNext/>
+              <w:spacing w:after="40" w:before="40" w:line="240" w:lineRule="auto"/>
+              <w:ind w:firstLine="0" w:left="0" w:right="0"/>
+              <w:jc w:val="right"/>
+            </w:pPr>
+            <w:r>
+              <w:rPr>
+                <w:rFonts w:ascii="Times New Roman" w:hAnsi="Times New Roman"/>
+                <w:b w:val="0"/>
+                <w:sz w:val="16"/>
+              </w:rPr>
+              <w:t>367.27</w:t>
+            </w:r>
+          </w:p>
+        </w:tc>
+        <w:tc>
+          <w:tcPr>
+            <w:tcW w:type="dxa" w:w="739"/>
+            <w:vAlign w:val="center"/>
+            <w:tcMar>
+              <w:left w:w="58" w:type="dxa"/>
+              <w:right w:w="58" w:type="dxa"/>
+            </w:tcMar>
+          </w:tcPr>
+          <w:p>
+            <w:pPr>
+              <w:keepNext/>
+              <w:spacing w:after="40" w:before="40" w:line="240" w:lineRule="auto"/>
+              <w:ind w:firstLine="0" w:left="0" w:right="0"/>
+              <w:jc w:val="right"/>
+            </w:pPr>
+            <w:r>
+              <w:rPr>
+                <w:rFonts w:ascii="Times New Roman" w:hAnsi="Times New Roman"/>
+                <w:b w:val="0"/>
+                <w:sz w:val="16"/>
+              </w:rPr>
+              <w:t>10.30</w:t>
+            </w:r>
+          </w:p>
+        </w:tc>
+      </w:tr>
+      <w:tr>
+        <w:trPr>
+          <w:cantSplit/>
+        </w:trPr>
+        <w:tc>
+          <w:tcPr>
+            <w:tcW w:type="dxa" w:w="1043"/>
+            <w:vAlign w:val="center"/>
+            <w:tcMar>
+              <w:left w:w="58" w:type="dxa"/>
+              <w:right w:w="58" w:type="dxa"/>
+            </w:tcMar>
+          </w:tcPr>
+          <w:p>
+            <w:pPr>
+              <w:keepNext/>
+              <w:spacing w:after="40" w:before="40" w:line="240" w:lineRule="auto"/>
+              <w:ind w:firstLine="0" w:left="0" w:right="0"/>
+              <w:jc w:val="left"/>
+            </w:pPr>
+            <w:r>
+              <w:rPr>
+                <w:rFonts w:ascii="Times New Roman" w:hAnsi="Times New Roman"/>
+                <w:b w:val="0"/>
+                <w:sz w:val="16"/>
+              </w:rPr>
+              <w:t>10 / 1%</w:t>
+            </w:r>
+          </w:p>
+        </w:tc>
+        <w:tc>
+          <w:tcPr>
+            <w:tcW w:type="dxa" w:w="1086"/>
+            <w:vAlign w:val="center"/>
+            <w:tcMar>
+              <w:left w:w="58" w:type="dxa"/>
+              <w:right w:w="58" w:type="dxa"/>
+            </w:tcMar>
+          </w:tcPr>
+          <w:p>
+            <w:pPr>
+              <w:keepNext/>
+              <w:spacing w:after="40" w:before="40" w:line="240" w:lineRule="auto"/>
+              <w:ind w:firstLine="0" w:left="0" w:right="0"/>
+              <w:jc w:val="left"/>
+            </w:pPr>
+            <w:r>
+              <w:rPr>
+                <w:rFonts w:ascii="Times New Roman" w:hAnsi="Times New Roman"/>
+                <w:b w:val="0"/>
+                <w:sz w:val="16"/>
+              </w:rPr>
+              <w:t>Snapshot</w:t>
+            </w:r>
+          </w:p>
+        </w:tc>
+        <w:tc>
+          <w:tcPr>
+            <w:tcW w:type="dxa" w:w="782"/>
+            <w:vAlign w:val="center"/>
+            <w:tcMar>
+              <w:left w:w="58" w:type="dxa"/>
+              <w:right w:w="58" w:type="dxa"/>
+            </w:tcMar>
+          </w:tcPr>
+          <w:p>
+            <w:pPr>
+              <w:keepNext/>
+              <w:spacing w:after="40" w:before="40" w:line="240" w:lineRule="auto"/>
+              <w:ind w:firstLine="0" w:left="0" w:right="0"/>
+              <w:jc w:val="right"/>
+            </w:pPr>
+            <w:r>
+              <w:rPr>
+                <w:rFonts w:ascii="Times New Roman" w:hAnsi="Times New Roman"/>
+                <w:b w:val="0"/>
+                <w:sz w:val="16"/>
+              </w:rPr>
+              <w:t>265.73</w:t>
+            </w:r>
+          </w:p>
+        </w:tc>
+        <w:tc>
+          <w:tcPr>
+            <w:tcW w:type="dxa" w:w="695"/>
+            <w:vAlign w:val="center"/>
+            <w:tcMar>
+              <w:left w:w="58" w:type="dxa"/>
+              <w:right w:w="58" w:type="dxa"/>
+            </w:tcMar>
+          </w:tcPr>
+          <w:p>
+            <w:pPr>
+              <w:keepNext/>
+              <w:spacing w:after="40" w:before="40" w:line="240" w:lineRule="auto"/>
+              <w:ind w:firstLine="0" w:left="0" w:right="0"/>
+              <w:jc w:val="right"/>
+            </w:pPr>
+            <w:r>
+              <w:rPr>
+                <w:rFonts w:ascii="Times New Roman" w:hAnsi="Times New Roman"/>
+                <w:b w:val="0"/>
+                <w:sz w:val="16"/>
+              </w:rPr>
+              <w:t>1738.57</w:t>
+            </w:r>
+          </w:p>
+        </w:tc>
+        <w:tc>
+          <w:tcPr>
+            <w:tcW w:type="dxa" w:w="739"/>
+            <w:vAlign w:val="center"/>
+            <w:tcMar>
+              <w:left w:w="58" w:type="dxa"/>
+              <w:right w:w="58" w:type="dxa"/>
+            </w:tcMar>
+          </w:tcPr>
+          <w:p>
+            <w:pPr>
+              <w:keepNext/>
+              <w:spacing w:after="40" w:before="40" w:line="240" w:lineRule="auto"/>
+              <w:ind w:firstLine="0" w:left="0" w:right="0"/>
+              <w:jc w:val="right"/>
+            </w:pPr>
+            <w:r>
+              <w:rPr>
+                <w:rFonts w:ascii="Times New Roman" w:hAnsi="Times New Roman"/>
+                <w:b w:val="0"/>
+                <w:sz w:val="16"/>
+              </w:rPr>
+              <w:t>354.97</w:t>
+            </w:r>
+          </w:p>
+        </w:tc>
+      </w:tr>
+      <w:tr>
+        <w:trPr>
+          <w:cantSplit/>
+        </w:trPr>
+        <w:tc>
+          <w:tcPr>
+            <w:tcW w:type="dxa" w:w="1043"/>
+            <w:vAlign w:val="center"/>
+            <w:tcMar>
+              <w:left w:w="58" w:type="dxa"/>
+              <w:right w:w="58" w:type="dxa"/>
+            </w:tcMar>
+          </w:tcPr>
+          <w:p>
+            <w:pPr>
+              <w:keepNext/>
+              <w:spacing w:after="40" w:before="40" w:line="240" w:lineRule="auto"/>
+              <w:ind w:firstLine="0" w:left="0" w:right="0"/>
+              <w:jc w:val="left"/>
+            </w:pPr>
+            <w:r>
+              <w:rPr>
+                <w:rFonts w:ascii="Times New Roman" w:hAnsi="Times New Roman"/>
+                <w:b w:val="0"/>
+                <w:sz w:val="16"/>
+              </w:rPr>
+              <w:t>10 / 1%</w:t>
+            </w:r>
+          </w:p>
+        </w:tc>
+        <w:tc>
+          <w:tcPr>
+            <w:tcW w:type="dxa" w:w="1086"/>
+            <w:vAlign w:val="center"/>
+            <w:tcMar>
+              <w:left w:w="58" w:type="dxa"/>
+              <w:right w:w="58" w:type="dxa"/>
+            </w:tcMar>
+          </w:tcPr>
+          <w:p>
+            <w:pPr>
+              <w:keepNext/>
+              <w:spacing w:after="40" w:before="40" w:line="240" w:lineRule="auto"/>
+              <w:ind w:firstLine="0" w:left="0" w:right="0"/>
+              <w:jc w:val="left"/>
+            </w:pPr>
+            <w:r>
+              <w:rPr>
+                <w:rFonts w:ascii="Times New Roman" w:hAnsi="Times New Roman"/>
+                <w:b w:val="0"/>
+                <w:sz w:val="16"/>
+              </w:rPr>
+              <w:t>Log-only</w:t>
+            </w:r>
+          </w:p>
+        </w:tc>
+        <w:tc>
+          <w:tcPr>
+            <w:tcW w:type="dxa" w:w="782"/>
+            <w:vAlign w:val="center"/>
+            <w:tcMar>
+              <w:left w:w="58" w:type="dxa"/>
+              <w:right w:w="58" w:type="dxa"/>
+            </w:tcMar>
+          </w:tcPr>
+          <w:p>
+            <w:pPr>
+              <w:keepNext/>
+              <w:spacing w:after="40" w:before="40" w:line="240" w:lineRule="auto"/>
+              <w:ind w:firstLine="0" w:left="0" w:right="0"/>
+              <w:jc w:val="right"/>
+            </w:pPr>
+            <w:r>
+              <w:rPr>
+                <w:rFonts w:ascii="Times New Roman" w:hAnsi="Times New Roman"/>
+                <w:b w:val="0"/>
+                <w:sz w:val="16"/>
+              </w:rPr>
+              <w:t>11.04</w:t>
+            </w:r>
+          </w:p>
+        </w:tc>
+        <w:tc>
+          <w:tcPr>
+            <w:tcW w:type="dxa" w:w="695"/>
+            <w:vAlign w:val="center"/>
+            <w:tcMar>
+              <w:left w:w="58" w:type="dxa"/>
+              <w:right w:w="58" w:type="dxa"/>
+            </w:tcMar>
+          </w:tcPr>
+          <w:p>
+            <w:pPr>
+              <w:keepNext/>
+              <w:spacing w:after="40" w:before="40" w:line="240" w:lineRule="auto"/>
+              <w:ind w:firstLine="0" w:left="0" w:right="0"/>
+              <w:jc w:val="right"/>
+            </w:pPr>
+            <w:r>
+              <w:rPr>
+                <w:rFonts w:ascii="Times New Roman" w:hAnsi="Times New Roman"/>
+                <w:b w:val="0"/>
+                <w:sz w:val="16"/>
+              </w:rPr>
+              <w:t>146.20</w:t>
+            </w:r>
+          </w:p>
+        </w:tc>
+        <w:tc>
+          <w:tcPr>
+            <w:tcW w:type="dxa" w:w="739"/>
+            <w:vAlign w:val="center"/>
+            <w:tcMar>
+              <w:left w:w="58" w:type="dxa"/>
+              <w:right w:w="58" w:type="dxa"/>
+            </w:tcMar>
+          </w:tcPr>
+          <w:p>
+            <w:pPr>
+              <w:keepNext/>
+              <w:spacing w:after="40" w:before="40" w:line="240" w:lineRule="auto"/>
+              <w:ind w:firstLine="0" w:left="0" w:right="0"/>
+              <w:jc w:val="right"/>
+            </w:pPr>
+            <w:r>
+              <w:rPr>
+                <w:rFonts w:ascii="Times New Roman" w:hAnsi="Times New Roman"/>
+                <w:b w:val="0"/>
+                <w:sz w:val="16"/>
+              </w:rPr>
+              <w:t>38.90</w:t>
+            </w:r>
+          </w:p>
+        </w:tc>
+      </w:tr>
+      <w:tr>
+        <w:trPr>
+          <w:cantSplit/>
+        </w:trPr>
+        <w:tc>
+          <w:tcPr>
+            <w:tcW w:type="dxa" w:w="1043"/>
+            <w:vAlign w:val="center"/>
+            <w:tcMar>
+              <w:left w:w="58" w:type="dxa"/>
+              <w:right w:w="58" w:type="dxa"/>
+            </w:tcMar>
+          </w:tcPr>
+          <w:p>
+            <w:pPr>
+              <w:keepNext/>
+              <w:spacing w:after="40" w:before="40" w:line="240" w:lineRule="auto"/>
+              <w:ind w:firstLine="0" w:left="0" w:right="0"/>
+              <w:jc w:val="left"/>
+            </w:pPr>
+            <w:r>
+              <w:rPr>
+                <w:rFonts w:ascii="Times New Roman" w:hAnsi="Times New Roman"/>
+                <w:b w:val="0"/>
+                <w:sz w:val="16"/>
+              </w:rPr>
+              <w:t>10 / 1%</w:t>
+            </w:r>
+          </w:p>
+        </w:tc>
+        <w:tc>
+          <w:tcPr>
+            <w:tcW w:type="dxa" w:w="1086"/>
+            <w:vAlign w:val="center"/>
+            <w:tcMar>
+              <w:left w:w="58" w:type="dxa"/>
+              <w:right w:w="58" w:type="dxa"/>
+            </w:tcMar>
+          </w:tcPr>
+          <w:p>
+            <w:pPr>
+              <w:keepNext/>
+              <w:spacing w:after="40" w:before="40" w:line="240" w:lineRule="auto"/>
+              <w:ind w:firstLine="0" w:left="0" w:right="0"/>
+              <w:jc w:val="left"/>
+            </w:pPr>
+            <w:r>
+              <w:rPr>
+                <w:rFonts w:ascii="Times New Roman" w:hAnsi="Times New Roman"/>
+                <w:b w:val="0"/>
+                <w:sz w:val="16"/>
+              </w:rPr>
+              <w:t>Revon-M</w:t>
+            </w:r>
+          </w:p>
+        </w:tc>
+        <w:tc>
+          <w:tcPr>
+            <w:tcW w:type="dxa" w:w="782"/>
+            <w:vAlign w:val="center"/>
+            <w:tcMar>
+              <w:left w:w="58" w:type="dxa"/>
+              <w:right w:w="58" w:type="dxa"/>
+            </w:tcMar>
+          </w:tcPr>
+          <w:p>
+            <w:pPr>
+              <w:keepNext/>
+              <w:spacing w:after="40" w:before="40" w:line="240" w:lineRule="auto"/>
+              <w:ind w:firstLine="0" w:left="0" w:right="0"/>
+              <w:jc w:val="right"/>
+            </w:pPr>
+            <w:r>
+              <w:rPr>
+                <w:rFonts w:ascii="Times New Roman" w:hAnsi="Times New Roman"/>
+                <w:b w:val="0"/>
+                <w:sz w:val="16"/>
+              </w:rPr>
+              <w:t>752.02</w:t>
+            </w:r>
+          </w:p>
+        </w:tc>
+        <w:tc>
+          <w:tcPr>
+            <w:tcW w:type="dxa" w:w="695"/>
+            <w:vAlign w:val="center"/>
+            <w:tcMar>
+              <w:left w:w="58" w:type="dxa"/>
+              <w:right w:w="58" w:type="dxa"/>
+            </w:tcMar>
+          </w:tcPr>
+          <w:p>
+            <w:pPr>
+              <w:keepNext/>
+              <w:spacing w:after="40" w:before="40" w:line="240" w:lineRule="auto"/>
+              <w:ind w:firstLine="0" w:left="0" w:right="0"/>
+              <w:jc w:val="right"/>
+            </w:pPr>
+            <w:r>
+              <w:rPr>
+                <w:rFonts w:ascii="Times New Roman" w:hAnsi="Times New Roman"/>
+                <w:b w:val="0"/>
+                <w:sz w:val="16"/>
+              </w:rPr>
+              <w:t>164.79</w:t>
+            </w:r>
+          </w:p>
+        </w:tc>
+        <w:tc>
+          <w:tcPr>
+            <w:tcW w:type="dxa" w:w="739"/>
+            <w:vAlign w:val="center"/>
+            <w:tcMar>
+              <w:left w:w="58" w:type="dxa"/>
+              <w:right w:w="58" w:type="dxa"/>
+            </w:tcMar>
+          </w:tcPr>
+          <w:p>
+            <w:pPr>
+              <w:keepNext/>
+              <w:spacing w:after="40" w:before="40" w:line="240" w:lineRule="auto"/>
+              <w:ind w:firstLine="0" w:left="0" w:right="0"/>
+              <w:jc w:val="right"/>
+            </w:pPr>
+            <w:r>
+              <w:rPr>
+                <w:rFonts w:ascii="Times New Roman" w:hAnsi="Times New Roman"/>
+                <w:b w:val="0"/>
+                <w:sz w:val="16"/>
+              </w:rPr>
+              <w:t>177.68</w:t>
+            </w:r>
+          </w:p>
+        </w:tc>
+      </w:tr>
+      <w:tr>
+        <w:trPr>
+          <w:cantSplit/>
+        </w:trPr>
+        <w:tc>
+          <w:tcPr>
+            <w:tcW w:type="dxa" w:w="1043"/>
+            <w:vAlign w:val="center"/>
+            <w:tcMar>
+              <w:left w:w="58" w:type="dxa"/>
+              <w:right w:w="58" w:type="dxa"/>
+            </w:tcMar>
+          </w:tcPr>
+          <w:p>
+            <w:pPr>
+              <w:keepNext/>
+              <w:spacing w:after="40" w:before="40" w:line="240" w:lineRule="auto"/>
+              <w:ind w:firstLine="0" w:left="0" w:right="0"/>
+              <w:jc w:val="left"/>
+            </w:pPr>
+            <w:r>
+              <w:rPr>
+                <w:rFonts w:ascii="Times New Roman" w:hAnsi="Times New Roman"/>
+                <w:b w:val="0"/>
+                <w:sz w:val="16"/>
+              </w:rPr>
+              <w:t>10 / 1%</w:t>
+            </w:r>
+          </w:p>
+        </w:tc>
+        <w:tc>
+          <w:tcPr>
+            <w:tcW w:type="dxa" w:w="1086"/>
+            <w:vAlign w:val="center"/>
+            <w:tcMar>
+              <w:left w:w="58" w:type="dxa"/>
+              <w:right w:w="58" w:type="dxa"/>
+            </w:tcMar>
+          </w:tcPr>
+          <w:p>
+            <w:pPr>
+              <w:keepNext/>
+              <w:spacing w:after="40" w:before="40" w:line="240" w:lineRule="auto"/>
+              <w:ind w:firstLine="0" w:left="0" w:right="0"/>
+              <w:jc w:val="left"/>
+            </w:pPr>
+            <w:r>
+              <w:rPr>
+                <w:rFonts w:ascii="Times New Roman" w:hAnsi="Times New Roman"/>
+                <w:b w:val="0"/>
+                <w:sz w:val="16"/>
+              </w:rPr>
+              <w:t>Revon-H</w:t>
+            </w:r>
+          </w:p>
+        </w:tc>
+        <w:tc>
+          <w:tcPr>
+            <w:tcW w:type="dxa" w:w="782"/>
+            <w:vAlign w:val="center"/>
+            <w:tcMar>
+              <w:left w:w="58" w:type="dxa"/>
+              <w:right w:w="58" w:type="dxa"/>
+            </w:tcMar>
+          </w:tcPr>
+          <w:p>
+            <w:pPr>
+              <w:keepNext/>
+              <w:spacing w:after="40" w:before="40" w:line="240" w:lineRule="auto"/>
+              <w:ind w:firstLine="0" w:left="0" w:right="0"/>
+              <w:jc w:val="right"/>
+            </w:pPr>
+            <w:r>
+              <w:rPr>
+                <w:rFonts w:ascii="Times New Roman" w:hAnsi="Times New Roman"/>
+                <w:b w:val="0"/>
+                <w:sz w:val="16"/>
+              </w:rPr>
+              <w:t>679.38</w:t>
+            </w:r>
+          </w:p>
+        </w:tc>
+        <w:tc>
+          <w:tcPr>
+            <w:tcW w:type="dxa" w:w="695"/>
+            <w:vAlign w:val="center"/>
+            <w:tcMar>
+              <w:left w:w="58" w:type="dxa"/>
+              <w:right w:w="58" w:type="dxa"/>
+            </w:tcMar>
+          </w:tcPr>
+          <w:p>
+            <w:pPr>
+              <w:keepNext/>
+              <w:spacing w:after="40" w:before="40" w:line="240" w:lineRule="auto"/>
+              <w:ind w:firstLine="0" w:left="0" w:right="0"/>
+              <w:jc w:val="right"/>
+            </w:pPr>
+            <w:r>
+              <w:rPr>
+                <w:rFonts w:ascii="Times New Roman" w:hAnsi="Times New Roman"/>
+                <w:b w:val="0"/>
+                <w:sz w:val="16"/>
+              </w:rPr>
+              <w:t>166.75</w:t>
+            </w:r>
+          </w:p>
+        </w:tc>
+        <w:tc>
+          <w:tcPr>
+            <w:tcW w:type="dxa" w:w="739"/>
+            <w:vAlign w:val="center"/>
+            <w:tcMar>
+              <w:left w:w="58" w:type="dxa"/>
+              <w:right w:w="58" w:type="dxa"/>
+            </w:tcMar>
+          </w:tcPr>
+          <w:p>
+            <w:pPr>
+              <w:keepNext/>
+              <w:spacing w:after="40" w:before="40" w:line="240" w:lineRule="auto"/>
+              <w:ind w:firstLine="0" w:left="0" w:right="0"/>
+              <w:jc w:val="right"/>
+            </w:pPr>
+            <w:r>
+              <w:rPr>
+                <w:rFonts w:ascii="Times New Roman" w:hAnsi="Times New Roman"/>
+                <w:b w:val="0"/>
+                <w:sz w:val="16"/>
+              </w:rPr>
+              <w:t>177.66</w:t>
+            </w:r>
+          </w:p>
+        </w:tc>
+      </w:tr>
+      <w:tr>
+        <w:trPr>
+          <w:cantSplit/>
+        </w:trPr>
+        <w:tc>
+          <w:tcPr>
+            <w:tcW w:type="dxa" w:w="1043"/>
+            <w:vAlign w:val="center"/>
+            <w:tcMar>
+              <w:left w:w="58" w:type="dxa"/>
+              <w:right w:w="58" w:type="dxa"/>
+            </w:tcMar>
+          </w:tcPr>
+          <w:p>
+            <w:pPr>
+              <w:keepNext/>
+              <w:spacing w:after="40" w:before="40" w:line="240" w:lineRule="auto"/>
+              <w:ind w:firstLine="0" w:left="0" w:right="0"/>
+              <w:jc w:val="left"/>
+            </w:pPr>
+            <w:r>
+              <w:rPr>
+                <w:rFonts w:ascii="Times New Roman" w:hAnsi="Times New Roman"/>
+                <w:b w:val="0"/>
+                <w:sz w:val="16"/>
+              </w:rPr>
+              <w:t>10 / 1%</w:t>
+            </w:r>
+          </w:p>
+        </w:tc>
+        <w:tc>
+          <w:tcPr>
+            <w:tcW w:type="dxa" w:w="1086"/>
+            <w:vAlign w:val="center"/>
+            <w:tcMar>
+              <w:left w:w="58" w:type="dxa"/>
+              <w:right w:w="58" w:type="dxa"/>
+            </w:tcMar>
+          </w:tcPr>
+          <w:p>
+            <w:pPr>
+              <w:keepNext/>
+              <w:spacing w:after="40" w:before="40" w:line="240" w:lineRule="auto"/>
+              <w:ind w:firstLine="0" w:left="0" w:right="0"/>
+              <w:jc w:val="left"/>
+            </w:pPr>
+            <w:r>
+              <w:rPr>
+                <w:rFonts w:ascii="Times New Roman" w:hAnsi="Times New Roman"/>
+                <w:b w:val="0"/>
+                <w:sz w:val="16"/>
+              </w:rPr>
+              <w:t>Dolt SQL</w:t>
+            </w:r>
+          </w:p>
+        </w:tc>
+        <w:tc>
+          <w:tcPr>
+            <w:tcW w:type="dxa" w:w="782"/>
+            <w:vAlign w:val="center"/>
+            <w:tcMar>
+              <w:left w:w="58" w:type="dxa"/>
+              <w:right w:w="58" w:type="dxa"/>
+            </w:tcMar>
+          </w:tcPr>
+          <w:p>
+            <w:pPr>
+              <w:keepNext/>
+              <w:spacing w:after="40" w:before="40" w:line="240" w:lineRule="auto"/>
+              <w:ind w:firstLine="0" w:left="0" w:right="0"/>
+              <w:jc w:val="right"/>
+            </w:pPr>
+            <w:r>
+              <w:rPr>
+                <w:rFonts w:ascii="Times New Roman" w:hAnsi="Times New Roman"/>
+                <w:b w:val="0"/>
+                <w:sz w:val="16"/>
+              </w:rPr>
+              <w:t>943.05</w:t>
+            </w:r>
+          </w:p>
+        </w:tc>
+        <w:tc>
+          <w:tcPr>
+            <w:tcW w:type="dxa" w:w="695"/>
+            <w:vAlign w:val="center"/>
+            <w:tcMar>
+              <w:left w:w="58" w:type="dxa"/>
+              <w:right w:w="58" w:type="dxa"/>
+            </w:tcMar>
+          </w:tcPr>
+          <w:p>
+            <w:pPr>
+              <w:keepNext/>
+              <w:spacing w:after="40" w:before="40" w:line="240" w:lineRule="auto"/>
+              <w:ind w:firstLine="0" w:left="0" w:right="0"/>
+              <w:jc w:val="right"/>
+            </w:pPr>
+            <w:r>
+              <w:rPr>
+                <w:rFonts w:ascii="Times New Roman" w:hAnsi="Times New Roman"/>
+                <w:b w:val="0"/>
+                <w:sz w:val="16"/>
+              </w:rPr>
+              <w:t>740.59</w:t>
+            </w:r>
+          </w:p>
+        </w:tc>
+        <w:tc>
+          <w:tcPr>
+            <w:tcW w:type="dxa" w:w="739"/>
+            <w:vAlign w:val="center"/>
+            <w:tcMar>
+              <w:left w:w="58" w:type="dxa"/>
+              <w:right w:w="58" w:type="dxa"/>
+            </w:tcMar>
+          </w:tcPr>
+          <w:p>
+            <w:pPr>
+              <w:keepNext/>
+              <w:spacing w:after="40" w:before="40" w:line="240" w:lineRule="auto"/>
+              <w:ind w:firstLine="0" w:left="0" w:right="0"/>
+              <w:jc w:val="right"/>
+            </w:pPr>
+            <w:r>
+              <w:rPr>
+                <w:rFonts w:ascii="Times New Roman" w:hAnsi="Times New Roman"/>
+                <w:b w:val="0"/>
+                <w:sz w:val="16"/>
+              </w:rPr>
+              <w:t>25.31</w:t>
+            </w:r>
+          </w:p>
+        </w:tc>
+      </w:tr>
+      <w:tr>
+        <w:trPr>
+          <w:cantSplit/>
+        </w:trPr>
+        <w:tc>
+          <w:tcPr>
+            <w:tcW w:type="dxa" w:w="1043"/>
+            <w:vAlign w:val="center"/>
+            <w:tcMar>
+              <w:left w:w="58" w:type="dxa"/>
+              <w:right w:w="58" w:type="dxa"/>
+            </w:tcMar>
+          </w:tcPr>
+          <w:p>
+            <w:pPr>
+              <w:keepNext w:val="0"/>
+              <w:spacing w:after="40" w:before="40" w:line="240" w:lineRule="auto"/>
+              <w:ind w:firstLine="0" w:left="0" w:right="0"/>
+              <w:jc w:val="left"/>
+            </w:pPr>
+            <w:r>
+              <w:rPr>
+                <w:rFonts w:ascii="Times New Roman" w:hAnsi="Times New Roman"/>
+                <w:b w:val="0"/>
+                <w:sz w:val="16"/>
+              </w:rPr>
+              <w:t>10 / 1%</w:t>
+            </w:r>
+          </w:p>
+        </w:tc>
+        <w:tc>
+          <w:tcPr>
+            <w:tcW w:type="dxa" w:w="1086"/>
+            <w:vAlign w:val="center"/>
+            <w:tcMar>
+              <w:left w:w="58" w:type="dxa"/>
+              <w:right w:w="58" w:type="dxa"/>
+            </w:tcMar>
+          </w:tcPr>
+          <w:p>
+            <w:pPr>
+              <w:keepNext w:val="0"/>
+              <w:spacing w:after="40" w:before="40" w:line="240" w:lineRule="auto"/>
+              <w:ind w:firstLine="0" w:left="0" w:right="0"/>
+              <w:jc w:val="left"/>
+            </w:pPr>
+            <w:r>
+              <w:rPr>
+                <w:rFonts w:ascii="Times New Roman" w:hAnsi="Times New Roman"/>
+                <w:b w:val="0"/>
+                <w:sz w:val="16"/>
+              </w:rPr>
+              <w:t>Dolt CSV</w:t>
+            </w:r>
+          </w:p>
+        </w:tc>
+        <w:tc>
+          <w:tcPr>
+            <w:tcW w:type="dxa" w:w="782"/>
+            <w:vAlign w:val="center"/>
+            <w:tcMar>
+              <w:left w:w="58" w:type="dxa"/>
+              <w:right w:w="58" w:type="dxa"/>
+            </w:tcMar>
+          </w:tcPr>
+          <w:p>
+            <w:pPr>
+              <w:keepNext w:val="0"/>
+              <w:spacing w:after="40" w:before="40" w:line="240" w:lineRule="auto"/>
+              <w:ind w:firstLine="0" w:left="0" w:right="0"/>
+              <w:jc w:val="right"/>
+            </w:pPr>
+            <w:r>
+              <w:rPr>
+                <w:rFonts w:ascii="Times New Roman" w:hAnsi="Times New Roman"/>
+                <w:b w:val="0"/>
+                <w:sz w:val="16"/>
+              </w:rPr>
+              <w:t>976.99</w:t>
+            </w:r>
+          </w:p>
+        </w:tc>
+        <w:tc>
+          <w:tcPr>
+            <w:tcW w:type="dxa" w:w="695"/>
+            <w:vAlign w:val="center"/>
+            <w:tcMar>
+              <w:left w:w="58" w:type="dxa"/>
+              <w:right w:w="58" w:type="dxa"/>
+            </w:tcMar>
+          </w:tcPr>
+          <w:p>
+            <w:pPr>
+              <w:keepNext w:val="0"/>
+              <w:spacing w:after="40" w:before="40" w:line="240" w:lineRule="auto"/>
+              <w:ind w:firstLine="0" w:left="0" w:right="0"/>
+              <w:jc w:val="right"/>
+            </w:pPr>
+            <w:r>
+              <w:rPr>
+                <w:rFonts w:ascii="Times New Roman" w:hAnsi="Times New Roman"/>
+                <w:b w:val="0"/>
+                <w:sz w:val="16"/>
+              </w:rPr>
+              <w:t>702.91</w:t>
+            </w:r>
+          </w:p>
+        </w:tc>
+        <w:tc>
+          <w:tcPr>
+            <w:tcW w:type="dxa" w:w="739"/>
+            <w:vAlign w:val="center"/>
+            <w:tcMar>
+              <w:left w:w="58" w:type="dxa"/>
+              <w:right w:w="58" w:type="dxa"/>
+            </w:tcMar>
+          </w:tcPr>
+          <w:p>
+            <w:pPr>
+              <w:keepNext w:val="0"/>
+              <w:spacing w:after="40" w:before="40" w:line="240" w:lineRule="auto"/>
+              <w:ind w:firstLine="0" w:left="0" w:right="0"/>
+              <w:jc w:val="right"/>
+            </w:pPr>
+            <w:r>
+              <w:rPr>
+                <w:rFonts w:ascii="Times New Roman" w:hAnsi="Times New Roman"/>
+                <w:b w:val="0"/>
+                <w:sz w:val="16"/>
+              </w:rPr>
+              <w:t>24.75</w:t>
+            </w:r>
+          </w:p>
+        </w:tc>
+      </w:tr>
+    </w:tbl>
+    <w:p>
+      <w:pPr>
+        <w:keepNext w:val="0"/>
+        <w:pageBreakBefore w:val="0"/>
+        <w:spacing w:line="272" w:lineRule="exact" w:after="0"/>
+        <w:ind w:firstLine="216"/>
+        <w:jc w:val="both"/>
+      </w:pPr>
+      <w:r>
+        <w:t>At 100,000 records, the 10-commit 0.1% case accumulates 1,000 operations, while the 50-commit case accumulates 5,000 and the 1% case accumulates 10,000. Revon-H therefore uses the log path for the sparse short history and the Merkle path for the latter cases. This sweep evaluates the frozen selector under public record contents; it does not establish a new threshold or universal advantage. The update-only histories differ from the earlier mixed synthetic workloads.</w:t>
+      </w:r>
+    </w:p>
+    <w:p>
+      <w:pPr>
         <w:pStyle w:val="Heading1"/>
         <w:keepNext/>
         <w:spacing w:before="140" w:after="60"/>
@@ -6514,6 +10777,18 @@
     </w:p>
     <w:p>
       <w:pPr>
+        <w:keepNext w:val="0"/>
+        <w:pageBreakBefore w:val="0"/>
+        <w:spacing w:line="272" w:lineRule="exact" w:after="0"/>
+        <w:ind w:firstLine="216"/>
+        <w:jc w:val="both"/>
+      </w:pPr>
+      <w:r>
+        <w:t>The public-data sweeps extend the evidence to real record contents and larger states, but the histories remain generated. At fixed depth, increasing N increases expected leaf occupancy, so rewriting touched leaves can become more expensive even with an unchanged update percentage. The scale sweep also crosses the frozen selector threshold: Revon-H uses log diff at 10k/100k records and Merkle diff at 1M. Its diff curve therefore combines larger states with a strategy change. Longer histories likewise accumulate operations and can move Revon-H to the Merkle path. Figure 7 and Table V describe this host and record mapping; they do not isolate a tree algorithm, test relational queries, or measure naturally occurring corrections.</w:t>
+      </w:r>
+    </w:p>
+    <w:p>
+      <w:pPr>
         <w:pStyle w:val="Heading1"/>
         <w:keepNext/>
         <w:spacing w:before="140" w:after="60"/>
@@ -6562,7 +10837,7 @@
         <w:jc w:val="both"/>
       </w:pPr>
       <w:r>
-        <w:t>Dataset scope: The primary study reaches 100,000 rows. The sensitivity study uses flat key/value tables with 10,000 rows, three seeds, 32- and 128-byte values, histories of 10 and 50 commits, and three update patterns. We did not test alternate schemas, public multi-table datasets, or one-million-row datasets.</w:t>
+        <w:t>Dataset scope: The earlier synthetic study reaches 100,000 rows; the new public-record evaluation completes configurations up to 1,000,000 rows from one TLC monthly file with eleven retained fields. All public-data updates are generated, the scale sample uses one seed and an affine permutation, and key identities are valid only within the frozen release. We did not evaluate observed histories, multiple public datasets, multi-table workloads, relational queries or scale beyond the completed configurations.</w:t>
       </w:r>
     </w:p>
     <w:p>
@@ -6598,7 +10873,7 @@
         <w:jc w:val="both"/>
       </w:pPr>
       <w:r>
-        <w:t>Memory: We measured median whole-worker process-tree RSS in eight primary scenarios for Snapshot, Log-only, Revon-M, Revon-H, and SQL-path Dolt. These measurements include shared workload/oracle state and adapter processes, so they are not product-only memory figures. The parent process sampled every 10 ms outside timed operations. It may miss shorter peaks, and monitoring may add small scheduling pressure. Dolt bulk-import measurements are reported separately from SQL-path Dolt.</w:t>
+        <w:t>Memory: We measured median whole-worker process-tree RSS in eight primary scenarios for Snapshot, Log-only, Revon-M, Revon-H, and SQL-path Dolt. These measurements include shared workload/oracle state and adapter processes, so they are not product-only memory figures. The parent process sampled every 10 ms outside timed operations. It may miss shorter peaks, and monitoring may add small scheduling pressure. Dolt bulk-import measurements are reported separately from SQL-path Dolt. Public-data trials also include workload/oracle memory. The host had limited available RAM at launch; memory pressure and paging costs were not isolated from the workflow, so the measured scaling should not be read as an algorithm-only complexity result.</w:t>
       </w:r>
     </w:p>
     <w:p>
@@ -6672,7 +10947,7 @@
         <w:jc w:val="both"/>
       </w:pPr>
       <w:r>
-        <w:t>Moving beyond a linear prototype will require named branches, merge commits, conflict reporting, schema-aware records, concurrent readers and writers, ordered range scans, and remote synchronization. Evaluation also needs public structured datasets, workloads with one million rows, and replications by independent researchers on separate hardware. WSL2 I/O counters remain incomplete, and the Windows sensitivity counters cover the workflow rather than isolating individual operation costs.</w:t>
+        <w:t>Moving beyond a linear prototype will require named branches, merge commits, conflict reporting, schema-aware records, concurrent readers and writers, ordered range scans, and remote synchronization. Evaluation also needs additional public datasets, observed update histories, larger feasible states, and replications by independent researchers on separate hardware. WSL2 I/O counters remain incomplete, and the Windows sensitivity counters cover the workflow rather than isolating individual operation costs.</w:t>
       </w:r>
     </w:p>
     <w:p>
@@ -6700,7 +10975,7 @@
         <w:jc w:val="both"/>
       </w:pPr>
       <w:r>
-        <w:t>Revon demonstrates one way to version structured key/value data using immutable objects, incremental Merkle updates, SQLite persistence, historical checkout, and adaptive differencing. Paired intervals and a three-seed sensitivity study show workload-specific differences between Revon-H and the forced-Merkle ablation; the long-history result remains inconclusive. The experiments do not establish performance on real schemas or public datasets, or across independent hardware, concurrent workloads, and ordered range queries. The evidence describes a prototype, not a production-system replacement.</w:t>
+        <w:t>Revon demonstrates one way to version structured key/value data using immutable objects, incremental Merkle updates, SQLite persistence, historical checkout, and adaptive differencing. Paired intervals and a three-seed sensitivity study show workload-specific differences between Revon-H and the forced-Merkle ablation; the long-history result remains inconclusive. The public-record extension reaches 1,000,000 records from one TLC release using generated corrections. It does not establish performance across datasets, observed histories, independent hardware, concurrent workloads or ordered range queries. The evidence describes a prototype, not a production-system replacement.</w:t>
       </w:r>
     </w:p>
     <w:p>
@@ -7631,6 +11906,18 @@
     </w:p>
     <w:p>
       <w:pPr>
+        <w:pStyle w:val="IEEEReference"/>
+        <w:keepNext w:val="0"/>
+        <w:pageBreakBefore w:val="0"/>
+      </w:pPr>
+      <w:bookmarkStart w:id="31001" w:name="ref_31"/>
+      <w:r>
+        <w:t>New York City Taxi and Limousine Commission. 2024. TLC Trip Record Data: Yellow Taxi, January 2024. Public dataset. Retrieved October 1, 2026 from https://www.nyc.gov/site/tlc/about/tlc-trip-record-data.page.</w:t>
+      </w:r>
+      <w:bookmarkEnd w:id="31001"/>
+    </w:p>
+    <w:p>
+      <w:pPr>
         <w:pStyle w:val="Heading1"/>
         <w:keepNext/>
         <w:spacing w:before="140" w:after="60"/>
@@ -7656,6 +11943,17 @@
       </w:pPr>
       <w:r>
         <w:t>The repository includes the benchmark harness, evidence audit, paired-ratio analysis, multi-seed robustness study, and manuscript validation tools. The corrected primary paper-profile bundle is evidence/paper-corrected-issues13-17-counterbalanced-final-20260923; its paired ratio intervals are in paired_ratio_uncertainty.csv. The Windows and WSL2 sensitivity bundles are evidence/paper-issues18-20-robustness-20260923 and evidence/paper-issues18-20-linux-wsl-20260923. Supplemental Windows telemetry is in evidence/paper-issues14-windows-telemetry-20260924, and trie sensitivity results are in evidence/trie-sensitivity-issues8-20260923. These bundles retain raw rows, manifests, audits, summaries, and seed-cluster intervals. They support checks of evidence consistency; they do not independently reproduce timing results. The project repository is https://github.com/atharvasheersh/Revon.</w:t>
+      </w:r>
+      <w:r>
+        <w:t xml:space="preserve"> Public dataset acquisition and preparation are documented in docs/experiments/PUBLIC_DATASET_EVALUATION.md; experiments/public_dataset.py and experiments/public_dataset_study.py regenerate the checksum-pinned workload and run its sweeps. The TLC source is cited in </w:t>
+      </w:r>
+      <w:hyperlink w:anchor="ref_31">
+        <w:r>
+          <w:t>(NYC TLC, 2024)</w:t>
+        </w:r>
+      </w:hyperlink>
+      <w:r>
+        <w:t xml:space="preserve">. New bundles are evidence/public-tlc-combined-20261002. Raw and prepared trip records are downloaded locally and excluded from Git; retained timings, manifests, verification hashes and audited summaries are available with the code.</w:t>
       </w:r>
     </w:p>
     <w:p>

</xml_diff>